<commit_message>
Add mobile app with model picker and materials tab; scene images in Word
- mobile.html (built from mobile.src.html by build_mobile.py): swipeable
  A/B/C scenes, per-scene model photo picker (before/after makeup), model
  gallery by category, on-device added photos, materials viewer
- Word delivery script now shows a scene image strip under each version
- White background under photos with transparency
- Uploaded course materials stay out of git (materials/ is ignored)

Co-Authored-By: Claude Opus 5.5 <noreply@anthropic.com>
Claude-Session: https://claude.ai/code/session_01G7A9XvmaDKVefmK26e1iGa
</commit_message>
<xml_diff>
--- a/docs/beauty-shorts/shinjh-serum-01_납품대본.docx
+++ b/docs/beauty-shorts/shinjh-serum-01_납품대본.docx
@@ -2191,6 +2191,466 @@
     <w:p/>
     <w:p>
       <w:pPr>
+        <w:spacing w:after="60" w:before="120"/>
+      </w:pPr>
+      <w:r>
+        <w:rPr>
+          <w:rFonts w:ascii="Malgun Gothic" w:cs="Malgun Gothic" w:eastAsia="Malgun Gothic" w:hAnsi="Malgun Gothic"/>
+          <w:b/>
+          <w:bCs/>
+          <w:color w:val="8E244D"/>
+          <w:sz w:val="19"/>
+          <w:szCs w:val="19"/>
+        </w:rPr>
+        <w:t xml:space="preserve">A안 장면 시안 (고정 모델 · 얼굴 장면은 실사, 제품·손 장면은 일러스트)</w:t>
+      </w:r>
+    </w:p>
+    <w:tbl>
+      <w:tblPr>
+        <w:tblW w:type="dxa" w:w="14838"/>
+        <w:tblBorders>
+          <w:top w:val="single" w:color="auto" w:sz="4"/>
+          <w:left w:val="single" w:color="auto" w:sz="4"/>
+          <w:bottom w:val="single" w:color="auto" w:sz="4"/>
+          <w:right w:val="single" w:color="auto" w:sz="4"/>
+          <w:insideH w:val="single" w:color="auto" w:sz="4"/>
+          <w:insideV w:val="single" w:color="auto" w:sz="4"/>
+        </w:tblBorders>
+      </w:tblPr>
+      <w:tblGrid>
+        <w:gridCol w:w="2473"/>
+        <w:gridCol w:w="2473"/>
+        <w:gridCol w:w="2473"/>
+        <w:gridCol w:w="2473"/>
+        <w:gridCol w:w="2473"/>
+        <w:gridCol w:w="2473"/>
+      </w:tblGrid>
+      <w:tr>
+        <w:tc>
+          <w:tcPr>
+            <w:tcW w:type="dxa" w:w="2473"/>
+            <w:tcBorders>
+              <w:top w:val="none" w:color="FFFFFF" w:sz="0"/>
+              <w:left w:val="none" w:color="FFFFFF" w:sz="0"/>
+              <w:bottom w:val="none" w:color="FFFFFF" w:sz="0"/>
+              <w:right w:val="none" w:color="FFFFFF" w:sz="0"/>
+            </w:tcBorders>
+          </w:tcPr>
+          <w:p>
+            <w:pPr>
+              <w:jc w:val="center"/>
+            </w:pPr>
+            <w:r>
+              <w:drawing>
+                <wp:inline distT="0" distB="0" distL="0" distR="0">
+                  <wp:extent cx="1123950" cy="2000250"/>
+                  <wp:effectExtent t="0" r="0" b="0" l="0"/>
+                  <wp:docPr id="1" name="" descr="" title=""/>
+                  <wp:cNvGraphicFramePr>
+                    <a:graphicFrameLocks xmlns:a="http://schemas.openxmlformats.org/drawingml/2006/main" noChangeAspect="1"/>
+                  </wp:cNvGraphicFramePr>
+                  <a:graphic xmlns:a="http://schemas.openxmlformats.org/drawingml/2006/main">
+                    <a:graphicData uri="http://schemas.openxmlformats.org/drawingml/2006/picture">
+                      <pic:pic xmlns:pic="http://schemas.openxmlformats.org/drawingml/2006/picture">
+                        <pic:nvPicPr>
+                          <pic:cNvPr id="0" name="" descr=""/>
+                          <pic:cNvPicPr>
+                            <a:picLocks noChangeAspect="1" noChangeArrowheads="1"/>
+                          </pic:cNvPicPr>
+                        </pic:nvPicPr>
+                        <pic:blipFill>
+                          <a:blip r:embed="rId7" cstate="none"/>
+                          <a:srcRect/>
+                          <a:stretch>
+                            <a:fillRect/>
+                          </a:stretch>
+                        </pic:blipFill>
+                        <pic:spPr bwMode="auto">
+                          <a:xfrm>
+                            <a:off x="0" y="0"/>
+                            <a:ext cx="1123950" cy="2000250"/>
+                          </a:xfrm>
+                          <a:prstGeom prst="rect">
+                            <a:avLst/>
+                          </a:prstGeom>
+                        </pic:spPr>
+                      </pic:pic>
+                    </a:graphicData>
+                  </a:graphic>
+                </wp:inline>
+              </w:drawing>
+            </w:r>
+          </w:p>
+          <w:p>
+            <w:pPr>
+              <w:jc w:val="center"/>
+            </w:pPr>
+            <w:r>
+              <w:rPr>
+                <w:rFonts w:ascii="Malgun Gothic" w:cs="Malgun Gothic" w:eastAsia="Malgun Gothic" w:hAnsi="Malgun Gothic"/>
+                <w:color w:val="74636B"/>
+                <w:sz w:val="17"/>
+                <w:szCs w:val="17"/>
+              </w:rPr>
+              <w:t xml:space="preserve">1번 · 0:00</w:t>
+            </w:r>
+          </w:p>
+        </w:tc>
+        <w:tc>
+          <w:tcPr>
+            <w:tcW w:type="dxa" w:w="2473"/>
+            <w:tcBorders>
+              <w:top w:val="none" w:color="FFFFFF" w:sz="0"/>
+              <w:left w:val="none" w:color="FFFFFF" w:sz="0"/>
+              <w:bottom w:val="none" w:color="FFFFFF" w:sz="0"/>
+              <w:right w:val="none" w:color="FFFFFF" w:sz="0"/>
+            </w:tcBorders>
+          </w:tcPr>
+          <w:p>
+            <w:pPr>
+              <w:jc w:val="center"/>
+            </w:pPr>
+            <w:r>
+              <w:drawing>
+                <wp:inline distT="0" distB="0" distL="0" distR="0">
+                  <wp:extent cx="1123950" cy="2000250"/>
+                  <wp:effectExtent t="0" r="0" b="0" l="0"/>
+                  <wp:docPr id="1" name="" descr="" title=""/>
+                  <wp:cNvGraphicFramePr>
+                    <a:graphicFrameLocks xmlns:a="http://schemas.openxmlformats.org/drawingml/2006/main" noChangeAspect="1"/>
+                  </wp:cNvGraphicFramePr>
+                  <a:graphic xmlns:a="http://schemas.openxmlformats.org/drawingml/2006/main">
+                    <a:graphicData uri="http://schemas.openxmlformats.org/drawingml/2006/picture">
+                      <pic:pic xmlns:pic="http://schemas.openxmlformats.org/drawingml/2006/picture">
+                        <pic:nvPicPr>
+                          <pic:cNvPr id="0" name="" descr=""/>
+                          <pic:cNvPicPr>
+                            <a:picLocks noChangeAspect="1" noChangeArrowheads="1"/>
+                          </pic:cNvPicPr>
+                        </pic:nvPicPr>
+                        <pic:blipFill>
+                          <a:blip r:embed="rId8" cstate="none"/>
+                          <a:srcRect/>
+                          <a:stretch>
+                            <a:fillRect/>
+                          </a:stretch>
+                        </pic:blipFill>
+                        <pic:spPr bwMode="auto">
+                          <a:xfrm>
+                            <a:off x="0" y="0"/>
+                            <a:ext cx="1123950" cy="2000250"/>
+                          </a:xfrm>
+                          <a:prstGeom prst="rect">
+                            <a:avLst/>
+                          </a:prstGeom>
+                        </pic:spPr>
+                      </pic:pic>
+                    </a:graphicData>
+                  </a:graphic>
+                </wp:inline>
+              </w:drawing>
+            </w:r>
+          </w:p>
+          <w:p>
+            <w:pPr>
+              <w:jc w:val="center"/>
+            </w:pPr>
+            <w:r>
+              <w:rPr>
+                <w:rFonts w:ascii="Malgun Gothic" w:cs="Malgun Gothic" w:eastAsia="Malgun Gothic" w:hAnsi="Malgun Gothic"/>
+                <w:color w:val="74636B"/>
+                <w:sz w:val="17"/>
+                <w:szCs w:val="17"/>
+              </w:rPr>
+              <w:t xml:space="preserve">2번 · 0:03</w:t>
+            </w:r>
+          </w:p>
+        </w:tc>
+        <w:tc>
+          <w:tcPr>
+            <w:tcW w:type="dxa" w:w="2473"/>
+            <w:tcBorders>
+              <w:top w:val="none" w:color="FFFFFF" w:sz="0"/>
+              <w:left w:val="none" w:color="FFFFFF" w:sz="0"/>
+              <w:bottom w:val="none" w:color="FFFFFF" w:sz="0"/>
+              <w:right w:val="none" w:color="FFFFFF" w:sz="0"/>
+            </w:tcBorders>
+          </w:tcPr>
+          <w:p>
+            <w:pPr>
+              <w:jc w:val="center"/>
+            </w:pPr>
+            <w:r>
+              <w:drawing>
+                <wp:inline distT="0" distB="0" distL="0" distR="0">
+                  <wp:extent cx="1123950" cy="2000250"/>
+                  <wp:effectExtent t="0" r="0" b="0" l="0"/>
+                  <wp:docPr id="1" name="" descr="" title=""/>
+                  <wp:cNvGraphicFramePr>
+                    <a:graphicFrameLocks xmlns:a="http://schemas.openxmlformats.org/drawingml/2006/main" noChangeAspect="1"/>
+                  </wp:cNvGraphicFramePr>
+                  <a:graphic xmlns:a="http://schemas.openxmlformats.org/drawingml/2006/main">
+                    <a:graphicData uri="http://schemas.openxmlformats.org/drawingml/2006/picture">
+                      <pic:pic xmlns:pic="http://schemas.openxmlformats.org/drawingml/2006/picture">
+                        <pic:nvPicPr>
+                          <pic:cNvPr id="0" name="" descr=""/>
+                          <pic:cNvPicPr>
+                            <a:picLocks noChangeAspect="1" noChangeArrowheads="1"/>
+                          </pic:cNvPicPr>
+                        </pic:nvPicPr>
+                        <pic:blipFill>
+                          <a:blip r:embed="rId9" cstate="none"/>
+                          <a:srcRect/>
+                          <a:stretch>
+                            <a:fillRect/>
+                          </a:stretch>
+                        </pic:blipFill>
+                        <pic:spPr bwMode="auto">
+                          <a:xfrm>
+                            <a:off x="0" y="0"/>
+                            <a:ext cx="1123950" cy="2000250"/>
+                          </a:xfrm>
+                          <a:prstGeom prst="rect">
+                            <a:avLst/>
+                          </a:prstGeom>
+                        </pic:spPr>
+                      </pic:pic>
+                    </a:graphicData>
+                  </a:graphic>
+                </wp:inline>
+              </w:drawing>
+            </w:r>
+          </w:p>
+          <w:p>
+            <w:pPr>
+              <w:jc w:val="center"/>
+            </w:pPr>
+            <w:r>
+              <w:rPr>
+                <w:rFonts w:ascii="Malgun Gothic" w:cs="Malgun Gothic" w:eastAsia="Malgun Gothic" w:hAnsi="Malgun Gothic"/>
+                <w:color w:val="74636B"/>
+                <w:sz w:val="17"/>
+                <w:szCs w:val="17"/>
+              </w:rPr>
+              <w:t xml:space="preserve">3번 · 0:06</w:t>
+            </w:r>
+          </w:p>
+        </w:tc>
+        <w:tc>
+          <w:tcPr>
+            <w:tcW w:type="dxa" w:w="2473"/>
+            <w:tcBorders>
+              <w:top w:val="none" w:color="FFFFFF" w:sz="0"/>
+              <w:left w:val="none" w:color="FFFFFF" w:sz="0"/>
+              <w:bottom w:val="none" w:color="FFFFFF" w:sz="0"/>
+              <w:right w:val="none" w:color="FFFFFF" w:sz="0"/>
+            </w:tcBorders>
+          </w:tcPr>
+          <w:p>
+            <w:pPr>
+              <w:jc w:val="center"/>
+            </w:pPr>
+            <w:r>
+              <w:drawing>
+                <wp:inline distT="0" distB="0" distL="0" distR="0">
+                  <wp:extent cx="1123950" cy="2000250"/>
+                  <wp:effectExtent t="0" r="0" b="0" l="0"/>
+                  <wp:docPr id="1" name="" descr="" title=""/>
+                  <wp:cNvGraphicFramePr>
+                    <a:graphicFrameLocks xmlns:a="http://schemas.openxmlformats.org/drawingml/2006/main" noChangeAspect="1"/>
+                  </wp:cNvGraphicFramePr>
+                  <a:graphic xmlns:a="http://schemas.openxmlformats.org/drawingml/2006/main">
+                    <a:graphicData uri="http://schemas.openxmlformats.org/drawingml/2006/picture">
+                      <pic:pic xmlns:pic="http://schemas.openxmlformats.org/drawingml/2006/picture">
+                        <pic:nvPicPr>
+                          <pic:cNvPr id="0" name="" descr=""/>
+                          <pic:cNvPicPr>
+                            <a:picLocks noChangeAspect="1" noChangeArrowheads="1"/>
+                          </pic:cNvPicPr>
+                        </pic:nvPicPr>
+                        <pic:blipFill>
+                          <a:blip r:embed="rId10" cstate="none"/>
+                          <a:srcRect/>
+                          <a:stretch>
+                            <a:fillRect/>
+                          </a:stretch>
+                        </pic:blipFill>
+                        <pic:spPr bwMode="auto">
+                          <a:xfrm>
+                            <a:off x="0" y="0"/>
+                            <a:ext cx="1123950" cy="2000250"/>
+                          </a:xfrm>
+                          <a:prstGeom prst="rect">
+                            <a:avLst/>
+                          </a:prstGeom>
+                        </pic:spPr>
+                      </pic:pic>
+                    </a:graphicData>
+                  </a:graphic>
+                </wp:inline>
+              </w:drawing>
+            </w:r>
+          </w:p>
+          <w:p>
+            <w:pPr>
+              <w:jc w:val="center"/>
+            </w:pPr>
+            <w:r>
+              <w:rPr>
+                <w:rFonts w:ascii="Malgun Gothic" w:cs="Malgun Gothic" w:eastAsia="Malgun Gothic" w:hAnsi="Malgun Gothic"/>
+                <w:color w:val="74636B"/>
+                <w:sz w:val="17"/>
+                <w:szCs w:val="17"/>
+              </w:rPr>
+              <w:t xml:space="preserve">4번 · 0:10</w:t>
+            </w:r>
+          </w:p>
+        </w:tc>
+        <w:tc>
+          <w:tcPr>
+            <w:tcW w:type="dxa" w:w="2473"/>
+            <w:tcBorders>
+              <w:top w:val="none" w:color="FFFFFF" w:sz="0"/>
+              <w:left w:val="none" w:color="FFFFFF" w:sz="0"/>
+              <w:bottom w:val="none" w:color="FFFFFF" w:sz="0"/>
+              <w:right w:val="none" w:color="FFFFFF" w:sz="0"/>
+            </w:tcBorders>
+          </w:tcPr>
+          <w:p>
+            <w:pPr>
+              <w:jc w:val="center"/>
+            </w:pPr>
+            <w:r>
+              <w:drawing>
+                <wp:inline distT="0" distB="0" distL="0" distR="0">
+                  <wp:extent cx="1123950" cy="2000250"/>
+                  <wp:effectExtent t="0" r="0" b="0" l="0"/>
+                  <wp:docPr id="1" name="" descr="" title=""/>
+                  <wp:cNvGraphicFramePr>
+                    <a:graphicFrameLocks xmlns:a="http://schemas.openxmlformats.org/drawingml/2006/main" noChangeAspect="1"/>
+                  </wp:cNvGraphicFramePr>
+                  <a:graphic xmlns:a="http://schemas.openxmlformats.org/drawingml/2006/main">
+                    <a:graphicData uri="http://schemas.openxmlformats.org/drawingml/2006/picture">
+                      <pic:pic xmlns:pic="http://schemas.openxmlformats.org/drawingml/2006/picture">
+                        <pic:nvPicPr>
+                          <pic:cNvPr id="0" name="" descr=""/>
+                          <pic:cNvPicPr>
+                            <a:picLocks noChangeAspect="1" noChangeArrowheads="1"/>
+                          </pic:cNvPicPr>
+                        </pic:nvPicPr>
+                        <pic:blipFill>
+                          <a:blip r:embed="rId11" cstate="none"/>
+                          <a:srcRect/>
+                          <a:stretch>
+                            <a:fillRect/>
+                          </a:stretch>
+                        </pic:blipFill>
+                        <pic:spPr bwMode="auto">
+                          <a:xfrm>
+                            <a:off x="0" y="0"/>
+                            <a:ext cx="1123950" cy="2000250"/>
+                          </a:xfrm>
+                          <a:prstGeom prst="rect">
+                            <a:avLst/>
+                          </a:prstGeom>
+                        </pic:spPr>
+                      </pic:pic>
+                    </a:graphicData>
+                  </a:graphic>
+                </wp:inline>
+              </w:drawing>
+            </w:r>
+          </w:p>
+          <w:p>
+            <w:pPr>
+              <w:jc w:val="center"/>
+            </w:pPr>
+            <w:r>
+              <w:rPr>
+                <w:rFonts w:ascii="Malgun Gothic" w:cs="Malgun Gothic" w:eastAsia="Malgun Gothic" w:hAnsi="Malgun Gothic"/>
+                <w:color w:val="74636B"/>
+                <w:sz w:val="17"/>
+                <w:szCs w:val="17"/>
+              </w:rPr>
+              <w:t xml:space="preserve">5번 · 0:15</w:t>
+            </w:r>
+          </w:p>
+        </w:tc>
+        <w:tc>
+          <w:tcPr>
+            <w:tcW w:type="dxa" w:w="2473"/>
+            <w:tcBorders>
+              <w:top w:val="none" w:color="FFFFFF" w:sz="0"/>
+              <w:left w:val="none" w:color="FFFFFF" w:sz="0"/>
+              <w:bottom w:val="none" w:color="FFFFFF" w:sz="0"/>
+              <w:right w:val="none" w:color="FFFFFF" w:sz="0"/>
+            </w:tcBorders>
+          </w:tcPr>
+          <w:p>
+            <w:pPr>
+              <w:jc w:val="center"/>
+            </w:pPr>
+            <w:r>
+              <w:drawing>
+                <wp:inline distT="0" distB="0" distL="0" distR="0">
+                  <wp:extent cx="1123950" cy="2000250"/>
+                  <wp:effectExtent t="0" r="0" b="0" l="0"/>
+                  <wp:docPr id="1" name="" descr="" title=""/>
+                  <wp:cNvGraphicFramePr>
+                    <a:graphicFrameLocks xmlns:a="http://schemas.openxmlformats.org/drawingml/2006/main" noChangeAspect="1"/>
+                  </wp:cNvGraphicFramePr>
+                  <a:graphic xmlns:a="http://schemas.openxmlformats.org/drawingml/2006/main">
+                    <a:graphicData uri="http://schemas.openxmlformats.org/drawingml/2006/picture">
+                      <pic:pic xmlns:pic="http://schemas.openxmlformats.org/drawingml/2006/picture">
+                        <pic:nvPicPr>
+                          <pic:cNvPr id="0" name="" descr=""/>
+                          <pic:cNvPicPr>
+                            <a:picLocks noChangeAspect="1" noChangeArrowheads="1"/>
+                          </pic:cNvPicPr>
+                        </pic:nvPicPr>
+                        <pic:blipFill>
+                          <a:blip r:embed="rId12" cstate="none"/>
+                          <a:srcRect/>
+                          <a:stretch>
+                            <a:fillRect/>
+                          </a:stretch>
+                        </pic:blipFill>
+                        <pic:spPr bwMode="auto">
+                          <a:xfrm>
+                            <a:off x="0" y="0"/>
+                            <a:ext cx="1123950" cy="2000250"/>
+                          </a:xfrm>
+                          <a:prstGeom prst="rect">
+                            <a:avLst/>
+                          </a:prstGeom>
+                        </pic:spPr>
+                      </pic:pic>
+                    </a:graphicData>
+                  </a:graphic>
+                </wp:inline>
+              </w:drawing>
+            </w:r>
+          </w:p>
+          <w:p>
+            <w:pPr>
+              <w:jc w:val="center"/>
+            </w:pPr>
+            <w:r>
+              <w:rPr>
+                <w:rFonts w:ascii="Malgun Gothic" w:cs="Malgun Gothic" w:eastAsia="Malgun Gothic" w:hAnsi="Malgun Gothic"/>
+                <w:color w:val="74636B"/>
+                <w:sz w:val="17"/>
+                <w:szCs w:val="17"/>
+              </w:rPr>
+              <w:t xml:space="preserve">6번 · 0:20</w:t>
+            </w:r>
+          </w:p>
+        </w:tc>
+      </w:tr>
+    </w:tbl>
+    <w:p/>
+    <w:p>
+      <w:pPr>
         <w:pStyle w:val="Heading1"/>
         <w:spacing w:after="120" w:before="240"/>
       </w:pPr>
@@ -3095,6 +3555,395 @@
                 <w:szCs w:val="19"/>
               </w:rPr>
               <w:t xml:space="preserve">수분 세럼 ABC · 프로필 링크 👆</w:t>
+            </w:r>
+          </w:p>
+        </w:tc>
+      </w:tr>
+    </w:tbl>
+    <w:p/>
+    <w:p>
+      <w:pPr>
+        <w:spacing w:after="60" w:before="120"/>
+      </w:pPr>
+      <w:r>
+        <w:rPr>
+          <w:rFonts w:ascii="Malgun Gothic" w:cs="Malgun Gothic" w:eastAsia="Malgun Gothic" w:hAnsi="Malgun Gothic"/>
+          <w:b/>
+          <w:bCs/>
+          <w:color w:val="8E244D"/>
+          <w:sz w:val="19"/>
+          <w:szCs w:val="19"/>
+        </w:rPr>
+        <w:t xml:space="preserve">B안 장면 시안 (고정 모델 · 얼굴 장면은 실사, 제품·손 장면은 일러스트)</w:t>
+      </w:r>
+    </w:p>
+    <w:tbl>
+      <w:tblPr>
+        <w:tblW w:type="dxa" w:w="12365"/>
+        <w:tblBorders>
+          <w:top w:val="single" w:color="auto" w:sz="4"/>
+          <w:left w:val="single" w:color="auto" w:sz="4"/>
+          <w:bottom w:val="single" w:color="auto" w:sz="4"/>
+          <w:right w:val="single" w:color="auto" w:sz="4"/>
+          <w:insideH w:val="single" w:color="auto" w:sz="4"/>
+          <w:insideV w:val="single" w:color="auto" w:sz="4"/>
+        </w:tblBorders>
+      </w:tblPr>
+      <w:tblGrid>
+        <w:gridCol w:w="2473"/>
+        <w:gridCol w:w="2473"/>
+        <w:gridCol w:w="2473"/>
+        <w:gridCol w:w="2473"/>
+        <w:gridCol w:w="2473"/>
+      </w:tblGrid>
+      <w:tr>
+        <w:tc>
+          <w:tcPr>
+            <w:tcW w:type="dxa" w:w="2473"/>
+            <w:tcBorders>
+              <w:top w:val="none" w:color="FFFFFF" w:sz="0"/>
+              <w:left w:val="none" w:color="FFFFFF" w:sz="0"/>
+              <w:bottom w:val="none" w:color="FFFFFF" w:sz="0"/>
+              <w:right w:val="none" w:color="FFFFFF" w:sz="0"/>
+            </w:tcBorders>
+          </w:tcPr>
+          <w:p>
+            <w:pPr>
+              <w:jc w:val="center"/>
+            </w:pPr>
+            <w:r>
+              <w:drawing>
+                <wp:inline distT="0" distB="0" distL="0" distR="0">
+                  <wp:extent cx="1123950" cy="2000250"/>
+                  <wp:effectExtent t="0" r="0" b="0" l="0"/>
+                  <wp:docPr id="1" name="" descr="" title=""/>
+                  <wp:cNvGraphicFramePr>
+                    <a:graphicFrameLocks xmlns:a="http://schemas.openxmlformats.org/drawingml/2006/main" noChangeAspect="1"/>
+                  </wp:cNvGraphicFramePr>
+                  <a:graphic xmlns:a="http://schemas.openxmlformats.org/drawingml/2006/main">
+                    <a:graphicData uri="http://schemas.openxmlformats.org/drawingml/2006/picture">
+                      <pic:pic xmlns:pic="http://schemas.openxmlformats.org/drawingml/2006/picture">
+                        <pic:nvPicPr>
+                          <pic:cNvPr id="0" name="" descr=""/>
+                          <pic:cNvPicPr>
+                            <a:picLocks noChangeAspect="1" noChangeArrowheads="1"/>
+                          </pic:cNvPicPr>
+                        </pic:nvPicPr>
+                        <pic:blipFill>
+                          <a:blip r:embed="rId13" cstate="none"/>
+                          <a:srcRect/>
+                          <a:stretch>
+                            <a:fillRect/>
+                          </a:stretch>
+                        </pic:blipFill>
+                        <pic:spPr bwMode="auto">
+                          <a:xfrm>
+                            <a:off x="0" y="0"/>
+                            <a:ext cx="1123950" cy="2000250"/>
+                          </a:xfrm>
+                          <a:prstGeom prst="rect">
+                            <a:avLst/>
+                          </a:prstGeom>
+                        </pic:spPr>
+                      </pic:pic>
+                    </a:graphicData>
+                  </a:graphic>
+                </wp:inline>
+              </w:drawing>
+            </w:r>
+          </w:p>
+          <w:p>
+            <w:pPr>
+              <w:jc w:val="center"/>
+            </w:pPr>
+            <w:r>
+              <w:rPr>
+                <w:rFonts w:ascii="Malgun Gothic" w:cs="Malgun Gothic" w:eastAsia="Malgun Gothic" w:hAnsi="Malgun Gothic"/>
+                <w:color w:val="74636B"/>
+                <w:sz w:val="17"/>
+                <w:szCs w:val="17"/>
+              </w:rPr>
+              <w:t xml:space="preserve">1번 · 0:00</w:t>
+            </w:r>
+          </w:p>
+        </w:tc>
+        <w:tc>
+          <w:tcPr>
+            <w:tcW w:type="dxa" w:w="2473"/>
+            <w:tcBorders>
+              <w:top w:val="none" w:color="FFFFFF" w:sz="0"/>
+              <w:left w:val="none" w:color="FFFFFF" w:sz="0"/>
+              <w:bottom w:val="none" w:color="FFFFFF" w:sz="0"/>
+              <w:right w:val="none" w:color="FFFFFF" w:sz="0"/>
+            </w:tcBorders>
+          </w:tcPr>
+          <w:p>
+            <w:pPr>
+              <w:jc w:val="center"/>
+            </w:pPr>
+            <w:r>
+              <w:drawing>
+                <wp:inline distT="0" distB="0" distL="0" distR="0">
+                  <wp:extent cx="1123950" cy="2000250"/>
+                  <wp:effectExtent t="0" r="0" b="0" l="0"/>
+                  <wp:docPr id="1" name="" descr="" title=""/>
+                  <wp:cNvGraphicFramePr>
+                    <a:graphicFrameLocks xmlns:a="http://schemas.openxmlformats.org/drawingml/2006/main" noChangeAspect="1"/>
+                  </wp:cNvGraphicFramePr>
+                  <a:graphic xmlns:a="http://schemas.openxmlformats.org/drawingml/2006/main">
+                    <a:graphicData uri="http://schemas.openxmlformats.org/drawingml/2006/picture">
+                      <pic:pic xmlns:pic="http://schemas.openxmlformats.org/drawingml/2006/picture">
+                        <pic:nvPicPr>
+                          <pic:cNvPr id="0" name="" descr=""/>
+                          <pic:cNvPicPr>
+                            <a:picLocks noChangeAspect="1" noChangeArrowheads="1"/>
+                          </pic:cNvPicPr>
+                        </pic:nvPicPr>
+                        <pic:blipFill>
+                          <a:blip r:embed="rId14" cstate="none"/>
+                          <a:srcRect/>
+                          <a:stretch>
+                            <a:fillRect/>
+                          </a:stretch>
+                        </pic:blipFill>
+                        <pic:spPr bwMode="auto">
+                          <a:xfrm>
+                            <a:off x="0" y="0"/>
+                            <a:ext cx="1123950" cy="2000250"/>
+                          </a:xfrm>
+                          <a:prstGeom prst="rect">
+                            <a:avLst/>
+                          </a:prstGeom>
+                        </pic:spPr>
+                      </pic:pic>
+                    </a:graphicData>
+                  </a:graphic>
+                </wp:inline>
+              </w:drawing>
+            </w:r>
+          </w:p>
+          <w:p>
+            <w:pPr>
+              <w:jc w:val="center"/>
+            </w:pPr>
+            <w:r>
+              <w:rPr>
+                <w:rFonts w:ascii="Malgun Gothic" w:cs="Malgun Gothic" w:eastAsia="Malgun Gothic" w:hAnsi="Malgun Gothic"/>
+                <w:color w:val="74636B"/>
+                <w:sz w:val="17"/>
+                <w:szCs w:val="17"/>
+              </w:rPr>
+              <w:t xml:space="preserve">2번 · 0:03</w:t>
+            </w:r>
+          </w:p>
+        </w:tc>
+        <w:tc>
+          <w:tcPr>
+            <w:tcW w:type="dxa" w:w="2473"/>
+            <w:tcBorders>
+              <w:top w:val="none" w:color="FFFFFF" w:sz="0"/>
+              <w:left w:val="none" w:color="FFFFFF" w:sz="0"/>
+              <w:bottom w:val="none" w:color="FFFFFF" w:sz="0"/>
+              <w:right w:val="none" w:color="FFFFFF" w:sz="0"/>
+            </w:tcBorders>
+          </w:tcPr>
+          <w:p>
+            <w:pPr>
+              <w:jc w:val="center"/>
+            </w:pPr>
+            <w:r>
+              <w:drawing>
+                <wp:inline distT="0" distB="0" distL="0" distR="0">
+                  <wp:extent cx="1123950" cy="2000250"/>
+                  <wp:effectExtent t="0" r="0" b="0" l="0"/>
+                  <wp:docPr id="1" name="" descr="" title=""/>
+                  <wp:cNvGraphicFramePr>
+                    <a:graphicFrameLocks xmlns:a="http://schemas.openxmlformats.org/drawingml/2006/main" noChangeAspect="1"/>
+                  </wp:cNvGraphicFramePr>
+                  <a:graphic xmlns:a="http://schemas.openxmlformats.org/drawingml/2006/main">
+                    <a:graphicData uri="http://schemas.openxmlformats.org/drawingml/2006/picture">
+                      <pic:pic xmlns:pic="http://schemas.openxmlformats.org/drawingml/2006/picture">
+                        <pic:nvPicPr>
+                          <pic:cNvPr id="0" name="" descr=""/>
+                          <pic:cNvPicPr>
+                            <a:picLocks noChangeAspect="1" noChangeArrowheads="1"/>
+                          </pic:cNvPicPr>
+                        </pic:nvPicPr>
+                        <pic:blipFill>
+                          <a:blip r:embed="rId15" cstate="none"/>
+                          <a:srcRect/>
+                          <a:stretch>
+                            <a:fillRect/>
+                          </a:stretch>
+                        </pic:blipFill>
+                        <pic:spPr bwMode="auto">
+                          <a:xfrm>
+                            <a:off x="0" y="0"/>
+                            <a:ext cx="1123950" cy="2000250"/>
+                          </a:xfrm>
+                          <a:prstGeom prst="rect">
+                            <a:avLst/>
+                          </a:prstGeom>
+                        </pic:spPr>
+                      </pic:pic>
+                    </a:graphicData>
+                  </a:graphic>
+                </wp:inline>
+              </w:drawing>
+            </w:r>
+          </w:p>
+          <w:p>
+            <w:pPr>
+              <w:jc w:val="center"/>
+            </w:pPr>
+            <w:r>
+              <w:rPr>
+                <w:rFonts w:ascii="Malgun Gothic" w:cs="Malgun Gothic" w:eastAsia="Malgun Gothic" w:hAnsi="Malgun Gothic"/>
+                <w:color w:val="74636B"/>
+                <w:sz w:val="17"/>
+                <w:szCs w:val="17"/>
+              </w:rPr>
+              <w:t xml:space="preserve">3번 · 0:07</w:t>
+            </w:r>
+          </w:p>
+        </w:tc>
+        <w:tc>
+          <w:tcPr>
+            <w:tcW w:type="dxa" w:w="2473"/>
+            <w:tcBorders>
+              <w:top w:val="none" w:color="FFFFFF" w:sz="0"/>
+              <w:left w:val="none" w:color="FFFFFF" w:sz="0"/>
+              <w:bottom w:val="none" w:color="FFFFFF" w:sz="0"/>
+              <w:right w:val="none" w:color="FFFFFF" w:sz="0"/>
+            </w:tcBorders>
+          </w:tcPr>
+          <w:p>
+            <w:pPr>
+              <w:jc w:val="center"/>
+            </w:pPr>
+            <w:r>
+              <w:drawing>
+                <wp:inline distT="0" distB="0" distL="0" distR="0">
+                  <wp:extent cx="1123950" cy="2000250"/>
+                  <wp:effectExtent t="0" r="0" b="0" l="0"/>
+                  <wp:docPr id="1" name="" descr="" title=""/>
+                  <wp:cNvGraphicFramePr>
+                    <a:graphicFrameLocks xmlns:a="http://schemas.openxmlformats.org/drawingml/2006/main" noChangeAspect="1"/>
+                  </wp:cNvGraphicFramePr>
+                  <a:graphic xmlns:a="http://schemas.openxmlformats.org/drawingml/2006/main">
+                    <a:graphicData uri="http://schemas.openxmlformats.org/drawingml/2006/picture">
+                      <pic:pic xmlns:pic="http://schemas.openxmlformats.org/drawingml/2006/picture">
+                        <pic:nvPicPr>
+                          <pic:cNvPr id="0" name="" descr=""/>
+                          <pic:cNvPicPr>
+                            <a:picLocks noChangeAspect="1" noChangeArrowheads="1"/>
+                          </pic:cNvPicPr>
+                        </pic:nvPicPr>
+                        <pic:blipFill>
+                          <a:blip r:embed="rId16" cstate="none"/>
+                          <a:srcRect/>
+                          <a:stretch>
+                            <a:fillRect/>
+                          </a:stretch>
+                        </pic:blipFill>
+                        <pic:spPr bwMode="auto">
+                          <a:xfrm>
+                            <a:off x="0" y="0"/>
+                            <a:ext cx="1123950" cy="2000250"/>
+                          </a:xfrm>
+                          <a:prstGeom prst="rect">
+                            <a:avLst/>
+                          </a:prstGeom>
+                        </pic:spPr>
+                      </pic:pic>
+                    </a:graphicData>
+                  </a:graphic>
+                </wp:inline>
+              </w:drawing>
+            </w:r>
+          </w:p>
+          <w:p>
+            <w:pPr>
+              <w:jc w:val="center"/>
+            </w:pPr>
+            <w:r>
+              <w:rPr>
+                <w:rFonts w:ascii="Malgun Gothic" w:cs="Malgun Gothic" w:eastAsia="Malgun Gothic" w:hAnsi="Malgun Gothic"/>
+                <w:color w:val="74636B"/>
+                <w:sz w:val="17"/>
+                <w:szCs w:val="17"/>
+              </w:rPr>
+              <w:t xml:space="preserve">4번 · 0:12</w:t>
+            </w:r>
+          </w:p>
+        </w:tc>
+        <w:tc>
+          <w:tcPr>
+            <w:tcW w:type="dxa" w:w="2473"/>
+            <w:tcBorders>
+              <w:top w:val="none" w:color="FFFFFF" w:sz="0"/>
+              <w:left w:val="none" w:color="FFFFFF" w:sz="0"/>
+              <w:bottom w:val="none" w:color="FFFFFF" w:sz="0"/>
+              <w:right w:val="none" w:color="FFFFFF" w:sz="0"/>
+            </w:tcBorders>
+          </w:tcPr>
+          <w:p>
+            <w:pPr>
+              <w:jc w:val="center"/>
+            </w:pPr>
+            <w:r>
+              <w:drawing>
+                <wp:inline distT="0" distB="0" distL="0" distR="0">
+                  <wp:extent cx="1123950" cy="2000250"/>
+                  <wp:effectExtent t="0" r="0" b="0" l="0"/>
+                  <wp:docPr id="1" name="" descr="" title=""/>
+                  <wp:cNvGraphicFramePr>
+                    <a:graphicFrameLocks xmlns:a="http://schemas.openxmlformats.org/drawingml/2006/main" noChangeAspect="1"/>
+                  </wp:cNvGraphicFramePr>
+                  <a:graphic xmlns:a="http://schemas.openxmlformats.org/drawingml/2006/main">
+                    <a:graphicData uri="http://schemas.openxmlformats.org/drawingml/2006/picture">
+                      <pic:pic xmlns:pic="http://schemas.openxmlformats.org/drawingml/2006/picture">
+                        <pic:nvPicPr>
+                          <pic:cNvPr id="0" name="" descr=""/>
+                          <pic:cNvPicPr>
+                            <a:picLocks noChangeAspect="1" noChangeArrowheads="1"/>
+                          </pic:cNvPicPr>
+                        </pic:nvPicPr>
+                        <pic:blipFill>
+                          <a:blip r:embed="rId17" cstate="none"/>
+                          <a:srcRect/>
+                          <a:stretch>
+                            <a:fillRect/>
+                          </a:stretch>
+                        </pic:blipFill>
+                        <pic:spPr bwMode="auto">
+                          <a:xfrm>
+                            <a:off x="0" y="0"/>
+                            <a:ext cx="1123950" cy="2000250"/>
+                          </a:xfrm>
+                          <a:prstGeom prst="rect">
+                            <a:avLst/>
+                          </a:prstGeom>
+                        </pic:spPr>
+                      </pic:pic>
+                    </a:graphicData>
+                  </a:graphic>
+                </wp:inline>
+              </w:drawing>
+            </w:r>
+          </w:p>
+          <w:p>
+            <w:pPr>
+              <w:jc w:val="center"/>
+            </w:pPr>
+            <w:r>
+              <w:rPr>
+                <w:rFonts w:ascii="Malgun Gothic" w:cs="Malgun Gothic" w:eastAsia="Malgun Gothic" w:hAnsi="Malgun Gothic"/>
+                <w:color w:val="74636B"/>
+                <w:sz w:val="17"/>
+                <w:szCs w:val="17"/>
+              </w:rPr>
+              <w:t xml:space="preserve">5번 · 0:20</w:t>
             </w:r>
           </w:p>
         </w:tc>
@@ -3867,6 +4716,324 @@
                 <w:szCs w:val="19"/>
               </w:rPr>
               <w:t xml:space="preserve">제품 정보 → 프로필 링크 👆</w:t>
+            </w:r>
+          </w:p>
+        </w:tc>
+      </w:tr>
+    </w:tbl>
+    <w:p/>
+    <w:p>
+      <w:pPr>
+        <w:spacing w:after="60" w:before="120"/>
+      </w:pPr>
+      <w:r>
+        <w:rPr>
+          <w:rFonts w:ascii="Malgun Gothic" w:cs="Malgun Gothic" w:eastAsia="Malgun Gothic" w:hAnsi="Malgun Gothic"/>
+          <w:b/>
+          <w:bCs/>
+          <w:color w:val="8E244D"/>
+          <w:sz w:val="19"/>
+          <w:szCs w:val="19"/>
+        </w:rPr>
+        <w:t xml:space="preserve">C안 장면 시안 (고정 모델 · 얼굴 장면은 실사, 제품·손 장면은 일러스트)</w:t>
+      </w:r>
+    </w:p>
+    <w:tbl>
+      <w:tblPr>
+        <w:tblW w:type="dxa" w:w="9892"/>
+        <w:tblBorders>
+          <w:top w:val="single" w:color="auto" w:sz="4"/>
+          <w:left w:val="single" w:color="auto" w:sz="4"/>
+          <w:bottom w:val="single" w:color="auto" w:sz="4"/>
+          <w:right w:val="single" w:color="auto" w:sz="4"/>
+          <w:insideH w:val="single" w:color="auto" w:sz="4"/>
+          <w:insideV w:val="single" w:color="auto" w:sz="4"/>
+        </w:tblBorders>
+      </w:tblPr>
+      <w:tblGrid>
+        <w:gridCol w:w="2473"/>
+        <w:gridCol w:w="2473"/>
+        <w:gridCol w:w="2473"/>
+        <w:gridCol w:w="2473"/>
+      </w:tblGrid>
+      <w:tr>
+        <w:tc>
+          <w:tcPr>
+            <w:tcW w:type="dxa" w:w="2473"/>
+            <w:tcBorders>
+              <w:top w:val="none" w:color="FFFFFF" w:sz="0"/>
+              <w:left w:val="none" w:color="FFFFFF" w:sz="0"/>
+              <w:bottom w:val="none" w:color="FFFFFF" w:sz="0"/>
+              <w:right w:val="none" w:color="FFFFFF" w:sz="0"/>
+            </w:tcBorders>
+          </w:tcPr>
+          <w:p>
+            <w:pPr>
+              <w:jc w:val="center"/>
+            </w:pPr>
+            <w:r>
+              <w:drawing>
+                <wp:inline distT="0" distB="0" distL="0" distR="0">
+                  <wp:extent cx="1123950" cy="2000250"/>
+                  <wp:effectExtent t="0" r="0" b="0" l="0"/>
+                  <wp:docPr id="1" name="" descr="" title=""/>
+                  <wp:cNvGraphicFramePr>
+                    <a:graphicFrameLocks xmlns:a="http://schemas.openxmlformats.org/drawingml/2006/main" noChangeAspect="1"/>
+                  </wp:cNvGraphicFramePr>
+                  <a:graphic xmlns:a="http://schemas.openxmlformats.org/drawingml/2006/main">
+                    <a:graphicData uri="http://schemas.openxmlformats.org/drawingml/2006/picture">
+                      <pic:pic xmlns:pic="http://schemas.openxmlformats.org/drawingml/2006/picture">
+                        <pic:nvPicPr>
+                          <pic:cNvPr id="0" name="" descr=""/>
+                          <pic:cNvPicPr>
+                            <a:picLocks noChangeAspect="1" noChangeArrowheads="1"/>
+                          </pic:cNvPicPr>
+                        </pic:nvPicPr>
+                        <pic:blipFill>
+                          <a:blip r:embed="rId18" cstate="none"/>
+                          <a:srcRect/>
+                          <a:stretch>
+                            <a:fillRect/>
+                          </a:stretch>
+                        </pic:blipFill>
+                        <pic:spPr bwMode="auto">
+                          <a:xfrm>
+                            <a:off x="0" y="0"/>
+                            <a:ext cx="1123950" cy="2000250"/>
+                          </a:xfrm>
+                          <a:prstGeom prst="rect">
+                            <a:avLst/>
+                          </a:prstGeom>
+                        </pic:spPr>
+                      </pic:pic>
+                    </a:graphicData>
+                  </a:graphic>
+                </wp:inline>
+              </w:drawing>
+            </w:r>
+          </w:p>
+          <w:p>
+            <w:pPr>
+              <w:jc w:val="center"/>
+            </w:pPr>
+            <w:r>
+              <w:rPr>
+                <w:rFonts w:ascii="Malgun Gothic" w:cs="Malgun Gothic" w:eastAsia="Malgun Gothic" w:hAnsi="Malgun Gothic"/>
+                <w:color w:val="74636B"/>
+                <w:sz w:val="17"/>
+                <w:szCs w:val="17"/>
+              </w:rPr>
+              <w:t xml:space="preserve">1번 · 0:00</w:t>
+            </w:r>
+          </w:p>
+        </w:tc>
+        <w:tc>
+          <w:tcPr>
+            <w:tcW w:type="dxa" w:w="2473"/>
+            <w:tcBorders>
+              <w:top w:val="none" w:color="FFFFFF" w:sz="0"/>
+              <w:left w:val="none" w:color="FFFFFF" w:sz="0"/>
+              <w:bottom w:val="none" w:color="FFFFFF" w:sz="0"/>
+              <w:right w:val="none" w:color="FFFFFF" w:sz="0"/>
+            </w:tcBorders>
+          </w:tcPr>
+          <w:p>
+            <w:pPr>
+              <w:jc w:val="center"/>
+            </w:pPr>
+            <w:r>
+              <w:drawing>
+                <wp:inline distT="0" distB="0" distL="0" distR="0">
+                  <wp:extent cx="1123950" cy="2000250"/>
+                  <wp:effectExtent t="0" r="0" b="0" l="0"/>
+                  <wp:docPr id="1" name="" descr="" title=""/>
+                  <wp:cNvGraphicFramePr>
+                    <a:graphicFrameLocks xmlns:a="http://schemas.openxmlformats.org/drawingml/2006/main" noChangeAspect="1"/>
+                  </wp:cNvGraphicFramePr>
+                  <a:graphic xmlns:a="http://schemas.openxmlformats.org/drawingml/2006/main">
+                    <a:graphicData uri="http://schemas.openxmlformats.org/drawingml/2006/picture">
+                      <pic:pic xmlns:pic="http://schemas.openxmlformats.org/drawingml/2006/picture">
+                        <pic:nvPicPr>
+                          <pic:cNvPr id="0" name="" descr=""/>
+                          <pic:cNvPicPr>
+                            <a:picLocks noChangeAspect="1" noChangeArrowheads="1"/>
+                          </pic:cNvPicPr>
+                        </pic:nvPicPr>
+                        <pic:blipFill>
+                          <a:blip r:embed="rId19" cstate="none"/>
+                          <a:srcRect/>
+                          <a:stretch>
+                            <a:fillRect/>
+                          </a:stretch>
+                        </pic:blipFill>
+                        <pic:spPr bwMode="auto">
+                          <a:xfrm>
+                            <a:off x="0" y="0"/>
+                            <a:ext cx="1123950" cy="2000250"/>
+                          </a:xfrm>
+                          <a:prstGeom prst="rect">
+                            <a:avLst/>
+                          </a:prstGeom>
+                        </pic:spPr>
+                      </pic:pic>
+                    </a:graphicData>
+                  </a:graphic>
+                </wp:inline>
+              </w:drawing>
+            </w:r>
+          </w:p>
+          <w:p>
+            <w:pPr>
+              <w:jc w:val="center"/>
+            </w:pPr>
+            <w:r>
+              <w:rPr>
+                <w:rFonts w:ascii="Malgun Gothic" w:cs="Malgun Gothic" w:eastAsia="Malgun Gothic" w:hAnsi="Malgun Gothic"/>
+                <w:color w:val="74636B"/>
+                <w:sz w:val="17"/>
+                <w:szCs w:val="17"/>
+              </w:rPr>
+              <w:t xml:space="preserve">2번 · 0:03</w:t>
+            </w:r>
+          </w:p>
+        </w:tc>
+        <w:tc>
+          <w:tcPr>
+            <w:tcW w:type="dxa" w:w="2473"/>
+            <w:tcBorders>
+              <w:top w:val="none" w:color="FFFFFF" w:sz="0"/>
+              <w:left w:val="none" w:color="FFFFFF" w:sz="0"/>
+              <w:bottom w:val="none" w:color="FFFFFF" w:sz="0"/>
+              <w:right w:val="none" w:color="FFFFFF" w:sz="0"/>
+            </w:tcBorders>
+          </w:tcPr>
+          <w:p>
+            <w:pPr>
+              <w:jc w:val="center"/>
+            </w:pPr>
+            <w:r>
+              <w:drawing>
+                <wp:inline distT="0" distB="0" distL="0" distR="0">
+                  <wp:extent cx="1123950" cy="2000250"/>
+                  <wp:effectExtent t="0" r="0" b="0" l="0"/>
+                  <wp:docPr id="1" name="" descr="" title=""/>
+                  <wp:cNvGraphicFramePr>
+                    <a:graphicFrameLocks xmlns:a="http://schemas.openxmlformats.org/drawingml/2006/main" noChangeAspect="1"/>
+                  </wp:cNvGraphicFramePr>
+                  <a:graphic xmlns:a="http://schemas.openxmlformats.org/drawingml/2006/main">
+                    <a:graphicData uri="http://schemas.openxmlformats.org/drawingml/2006/picture">
+                      <pic:pic xmlns:pic="http://schemas.openxmlformats.org/drawingml/2006/picture">
+                        <pic:nvPicPr>
+                          <pic:cNvPr id="0" name="" descr=""/>
+                          <pic:cNvPicPr>
+                            <a:picLocks noChangeAspect="1" noChangeArrowheads="1"/>
+                          </pic:cNvPicPr>
+                        </pic:nvPicPr>
+                        <pic:blipFill>
+                          <a:blip r:embed="rId20" cstate="none"/>
+                          <a:srcRect/>
+                          <a:stretch>
+                            <a:fillRect/>
+                          </a:stretch>
+                        </pic:blipFill>
+                        <pic:spPr bwMode="auto">
+                          <a:xfrm>
+                            <a:off x="0" y="0"/>
+                            <a:ext cx="1123950" cy="2000250"/>
+                          </a:xfrm>
+                          <a:prstGeom prst="rect">
+                            <a:avLst/>
+                          </a:prstGeom>
+                        </pic:spPr>
+                      </pic:pic>
+                    </a:graphicData>
+                  </a:graphic>
+                </wp:inline>
+              </w:drawing>
+            </w:r>
+          </w:p>
+          <w:p>
+            <w:pPr>
+              <w:jc w:val="center"/>
+            </w:pPr>
+            <w:r>
+              <w:rPr>
+                <w:rFonts w:ascii="Malgun Gothic" w:cs="Malgun Gothic" w:eastAsia="Malgun Gothic" w:hAnsi="Malgun Gothic"/>
+                <w:color w:val="74636B"/>
+                <w:sz w:val="17"/>
+                <w:szCs w:val="17"/>
+              </w:rPr>
+              <w:t xml:space="preserve">3번 · 0:10</w:t>
+            </w:r>
+          </w:p>
+        </w:tc>
+        <w:tc>
+          <w:tcPr>
+            <w:tcW w:type="dxa" w:w="2473"/>
+            <w:tcBorders>
+              <w:top w:val="none" w:color="FFFFFF" w:sz="0"/>
+              <w:left w:val="none" w:color="FFFFFF" w:sz="0"/>
+              <w:bottom w:val="none" w:color="FFFFFF" w:sz="0"/>
+              <w:right w:val="none" w:color="FFFFFF" w:sz="0"/>
+            </w:tcBorders>
+          </w:tcPr>
+          <w:p>
+            <w:pPr>
+              <w:jc w:val="center"/>
+            </w:pPr>
+            <w:r>
+              <w:drawing>
+                <wp:inline distT="0" distB="0" distL="0" distR="0">
+                  <wp:extent cx="1123950" cy="2000250"/>
+                  <wp:effectExtent t="0" r="0" b="0" l="0"/>
+                  <wp:docPr id="1" name="" descr="" title=""/>
+                  <wp:cNvGraphicFramePr>
+                    <a:graphicFrameLocks xmlns:a="http://schemas.openxmlformats.org/drawingml/2006/main" noChangeAspect="1"/>
+                  </wp:cNvGraphicFramePr>
+                  <a:graphic xmlns:a="http://schemas.openxmlformats.org/drawingml/2006/main">
+                    <a:graphicData uri="http://schemas.openxmlformats.org/drawingml/2006/picture">
+                      <pic:pic xmlns:pic="http://schemas.openxmlformats.org/drawingml/2006/picture">
+                        <pic:nvPicPr>
+                          <pic:cNvPr id="0" name="" descr=""/>
+                          <pic:cNvPicPr>
+                            <a:picLocks noChangeAspect="1" noChangeArrowheads="1"/>
+                          </pic:cNvPicPr>
+                        </pic:nvPicPr>
+                        <pic:blipFill>
+                          <a:blip r:embed="rId21" cstate="none"/>
+                          <a:srcRect/>
+                          <a:stretch>
+                            <a:fillRect/>
+                          </a:stretch>
+                        </pic:blipFill>
+                        <pic:spPr bwMode="auto">
+                          <a:xfrm>
+                            <a:off x="0" y="0"/>
+                            <a:ext cx="1123950" cy="2000250"/>
+                          </a:xfrm>
+                          <a:prstGeom prst="rect">
+                            <a:avLst/>
+                          </a:prstGeom>
+                        </pic:spPr>
+                      </pic:pic>
+                    </a:graphicData>
+                  </a:graphic>
+                </wp:inline>
+              </w:drawing>
+            </w:r>
+          </w:p>
+          <w:p>
+            <w:pPr>
+              <w:jc w:val="center"/>
+            </w:pPr>
+            <w:r>
+              <w:rPr>
+                <w:rFonts w:ascii="Malgun Gothic" w:cs="Malgun Gothic" w:eastAsia="Malgun Gothic" w:hAnsi="Malgun Gothic"/>
+                <w:color w:val="74636B"/>
+                <w:sz w:val="17"/>
+                <w:szCs w:val="17"/>
+              </w:rPr>
+              <w:t xml:space="preserve">4번 · 0:20</w:t>
             </w:r>
           </w:p>
         </w:tc>

</xml_diff>

<commit_message>
Mobile control bar, product panel, per-scene shooting techniques
- Control bar: subtitle font/size/position/colors and editing, BGM (in-app
  synth presets or own file), Fish Audio voice workflow (script copy, voice
  file import, speed/emotion), timed playback, save and edit-spec copy
- Product panel: name, URL, product image via file/drag/paste; replaces the
  illustrated bottle and the storyboard title
- Detailed shooting technique for every scene in app data, storyboards,
  Markdown and Word, plus a basic camera setup section

Co-Authored-By: Claude Opus 5.5 <noreply@anthropic.com>
Claude-Session: https://claude.ai/code/session_01G7A9XvmaDKVefmK26e1iGa
</commit_message>
<xml_diff>
--- a/docs/beauty-shorts/shinjh-serum-01_납품대본.docx
+++ b/docs/beauty-shorts/shinjh-serum-01_납품대본.docx
@@ -876,6 +876,135 @@
           <w:sz w:val="20"/>
           <w:szCs w:val="20"/>
         </w:rPr>
+        <w:t xml:space="preserve">촬영 기본 세팅</w:t>
+      </w:r>
+      <w:r>
+        <w:rPr>
+          <w:rFonts w:ascii="Malgun Gothic" w:cs="Malgun Gothic" w:eastAsia="Malgun Gothic" w:hAnsi="Malgun Gothic"/>
+          <w:sz w:val="20"/>
+          <w:szCs w:val="20"/>
+        </w:rPr>
+        <w:t xml:space="preserve"> (폰 기준)</w:t>
+      </w:r>
+    </w:p>
+    <w:p>
+      <w:pPr>
+        <w:pStyle w:val="ListParagraph"/>
+        <w:numPr>
+          <w:ilvl w:val="1"/>
+          <w:numId w:val="2"/>
+        </w:numPr>
+      </w:pPr>
+      <w:r>
+        <w:rPr>
+          <w:rFonts w:ascii="Malgun Gothic" w:cs="Malgun Gothic" w:eastAsia="Malgun Gothic" w:hAnsi="Malgun Gothic"/>
+          <w:sz w:val="20"/>
+          <w:szCs w:val="20"/>
+        </w:rPr>
+        <w:t xml:space="preserve">4K 30fps 세로 촬영, 슬로모션 컷은 120fps 이상. 화면 확대(디지털 줌) 금지 — 2x·3x 렌즈를 쓰거나 카메라를 직접 가까이.</w:t>
+      </w:r>
+    </w:p>
+    <w:p>
+      <w:pPr>
+        <w:pStyle w:val="ListParagraph"/>
+        <w:numPr>
+          <w:ilvl w:val="1"/>
+          <w:numId w:val="2"/>
+        </w:numPr>
+      </w:pPr>
+      <w:r>
+        <w:rPr>
+          <w:rFonts w:ascii="Malgun Gothic" w:cs="Malgun Gothic" w:eastAsia="Malgun Gothic" w:hAnsi="Malgun Gothic"/>
+          <w:sz w:val="20"/>
+          <w:szCs w:val="20"/>
+        </w:rPr>
+        <w:t xml:space="preserve">촬영 전 노출·초점 고정(화면 길게 눌러 AE/AF 잠금), 화이트밸런스 5000K 근처로 고정해 장면마다 피부톤이 달라지지 않게.</w:t>
+      </w:r>
+    </w:p>
+    <w:p>
+      <w:pPr>
+        <w:pStyle w:val="ListParagraph"/>
+        <w:numPr>
+          <w:ilvl w:val="1"/>
+          <w:numId w:val="2"/>
+        </w:numPr>
+      </w:pPr>
+      <w:r>
+        <w:rPr>
+          <w:rFonts w:ascii="Malgun Gothic" w:cs="Malgun Gothic" w:eastAsia="Malgun Gothic" w:hAnsi="Malgun Gothic"/>
+          <w:sz w:val="20"/>
+          <w:szCs w:val="20"/>
+        </w:rPr>
+        <w:t xml:space="preserve">조명: 창가 자연광(오전 10시~오후 3시)을 키라이트로, 반대편 흰 반사판. 실내는 링라이트 정면 + 소프트박스 45°.</w:t>
+      </w:r>
+    </w:p>
+    <w:p>
+      <w:pPr>
+        <w:pStyle w:val="ListParagraph"/>
+        <w:numPr>
+          <w:ilvl w:val="1"/>
+          <w:numId w:val="2"/>
+        </w:numPr>
+      </w:pPr>
+      <w:r>
+        <w:rPr>
+          <w:rFonts w:ascii="Malgun Gothic" w:cs="Malgun Gothic" w:eastAsia="Malgun Gothic" w:hAnsi="Malgun Gothic"/>
+          <w:sz w:val="20"/>
+          <w:szCs w:val="20"/>
+        </w:rPr>
+        <w:t xml:space="preserve">고정 샷은 삼각대, 손 동작 샷은 오버헤드 암. 움직임은 줌이 아니라 카메라를 천천히 미는(푸시인) 방식.</w:t>
+      </w:r>
+    </w:p>
+    <w:p>
+      <w:pPr>
+        <w:pStyle w:val="ListParagraph"/>
+        <w:numPr>
+          <w:ilvl w:val="1"/>
+          <w:numId w:val="2"/>
+        </w:numPr>
+      </w:pPr>
+      <w:r>
+        <w:rPr>
+          <w:rFonts w:ascii="Malgun Gothic" w:cs="Malgun Gothic" w:eastAsia="Malgun Gothic" w:hAnsi="Malgun Gothic"/>
+          <w:sz w:val="20"/>
+          <w:szCs w:val="20"/>
+        </w:rPr>
+        <w:t xml:space="preserve">전후 비교 컷(DAY 1 / DAY 7 등)은 삼각대 위치를 바닥 테이프로 표시하고 같은 시간대·노출·화이트밸런스로.</w:t>
+      </w:r>
+    </w:p>
+    <w:p>
+      <w:pPr>
+        <w:pStyle w:val="ListParagraph"/>
+        <w:numPr>
+          <w:ilvl w:val="1"/>
+          <w:numId w:val="2"/>
+        </w:numPr>
+      </w:pPr>
+      <w:r>
+        <w:rPr>
+          <w:rFonts w:ascii="Malgun Gothic" w:cs="Malgun Gothic" w:eastAsia="Malgun Gothic" w:hAnsi="Malgun Gothic"/>
+          <w:sz w:val="20"/>
+          <w:szCs w:val="20"/>
+        </w:rPr>
+        <w:t xml:space="preserve">소리(방울·톡톡·문지름)는 휴대폰 마이크 대신 근접 핀마이크로 따로 녹음해 편집 때 맞춤.</w:t>
+      </w:r>
+    </w:p>
+    <w:p>
+      <w:pPr>
+        <w:pStyle w:val="ListParagraph"/>
+        <w:numPr>
+          <w:ilvl w:val="0"/>
+          <w:numId w:val="2"/>
+        </w:numPr>
+      </w:pPr>
+      <w:r>
+        <w:rPr>
+          <w:rFonts w:ascii="Malgun Gothic" w:cs="Malgun Gothic" w:eastAsia="Malgun Gothic" w:hAnsi="Malgun Gothic"/>
+          <w:b/>
+          <w:bCs/>
+          <w:sz w:val="20"/>
+          <w:szCs w:val="20"/>
+        </w:rPr>
         <w:t xml:space="preserve">필수 고지</w:t>
       </w:r>
       <w:r>
@@ -2650,6 +2779,648 @@
     </w:tbl>
     <w:p/>
     <w:p>
+      <w:r>
+        <w:rPr>
+          <w:rFonts w:ascii="Malgun Gothic" w:cs="Malgun Gothic" w:eastAsia="Malgun Gothic" w:hAnsi="Malgun Gothic"/>
+          <w:b/>
+          <w:bCs/>
+          <w:sz w:val="20"/>
+          <w:szCs w:val="20"/>
+        </w:rPr>
+        <w:t xml:space="preserve">A안 촬영 기법</w:t>
+      </w:r>
+    </w:p>
+    <w:tbl>
+      <w:tblPr>
+        <w:tblW w:type="dxa" w:w="14838"/>
+        <w:tblBorders>
+          <w:top w:val="single" w:color="auto" w:sz="4"/>
+          <w:left w:val="single" w:color="auto" w:sz="4"/>
+          <w:bottom w:val="single" w:color="auto" w:sz="4"/>
+          <w:right w:val="single" w:color="auto" w:sz="4"/>
+          <w:insideH w:val="single" w:color="auto" w:sz="4"/>
+          <w:insideV w:val="single" w:color="auto" w:sz="4"/>
+        </w:tblBorders>
+      </w:tblPr>
+      <w:tblGrid>
+        <w:gridCol w:w="1618"/>
+        <w:gridCol w:w="2428"/>
+        <w:gridCol w:w="10792"/>
+      </w:tblGrid>
+      <w:tr>
+        <w:trPr>
+          <w:tblHeader/>
+        </w:trPr>
+        <w:tc>
+          <w:tcPr>
+            <w:tcW w:type="dxa" w:w="1618"/>
+            <w:tcBorders>
+              <w:top w:val="single" w:color="BFBFBF" w:sz="4"/>
+              <w:left w:val="single" w:color="BFBFBF" w:sz="4"/>
+              <w:bottom w:val="single" w:color="BFBFBF" w:sz="4"/>
+              <w:right w:val="single" w:color="BFBFBF" w:sz="4"/>
+            </w:tcBorders>
+            <w:shd w:fill="F8E1EA" w:color="auto" w:val="clear"/>
+            <w:tcMar>
+              <w:top w:type="dxa" w:w="60"/>
+              <w:left w:type="dxa" w:w="100"/>
+              <w:bottom w:type="dxa" w:w="60"/>
+              <w:right w:type="dxa" w:w="100"/>
+            </w:tcMar>
+          </w:tcPr>
+          <w:p>
+            <w:r>
+              <w:rPr>
+                <w:rFonts w:ascii="Malgun Gothic" w:cs="Malgun Gothic" w:eastAsia="Malgun Gothic" w:hAnsi="Malgun Gothic"/>
+                <w:b/>
+                <w:bCs/>
+                <w:sz w:val="19"/>
+                <w:szCs w:val="19"/>
+              </w:rPr>
+              <w:t xml:space="preserve">장면</w:t>
+            </w:r>
+          </w:p>
+        </w:tc>
+        <w:tc>
+          <w:tcPr>
+            <w:tcW w:type="dxa" w:w="2428"/>
+            <w:tcBorders>
+              <w:top w:val="single" w:color="BFBFBF" w:sz="4"/>
+              <w:left w:val="single" w:color="BFBFBF" w:sz="4"/>
+              <w:bottom w:val="single" w:color="BFBFBF" w:sz="4"/>
+              <w:right w:val="single" w:color="BFBFBF" w:sz="4"/>
+            </w:tcBorders>
+            <w:shd w:fill="F8E1EA" w:color="auto" w:val="clear"/>
+            <w:tcMar>
+              <w:top w:type="dxa" w:w="60"/>
+              <w:left w:type="dxa" w:w="100"/>
+              <w:bottom w:type="dxa" w:w="60"/>
+              <w:right w:type="dxa" w:w="100"/>
+            </w:tcMar>
+          </w:tcPr>
+          <w:p>
+            <w:r>
+              <w:rPr>
+                <w:rFonts w:ascii="Malgun Gothic" w:cs="Malgun Gothic" w:eastAsia="Malgun Gothic" w:hAnsi="Malgun Gothic"/>
+                <w:b/>
+                <w:bCs/>
+                <w:sz w:val="19"/>
+                <w:szCs w:val="19"/>
+              </w:rPr>
+              <w:t xml:space="preserve">시간</w:t>
+            </w:r>
+          </w:p>
+        </w:tc>
+        <w:tc>
+          <w:tcPr>
+            <w:tcW w:type="dxa" w:w="10792"/>
+            <w:tcBorders>
+              <w:top w:val="single" w:color="BFBFBF" w:sz="4"/>
+              <w:left w:val="single" w:color="BFBFBF" w:sz="4"/>
+              <w:bottom w:val="single" w:color="BFBFBF" w:sz="4"/>
+              <w:right w:val="single" w:color="BFBFBF" w:sz="4"/>
+            </w:tcBorders>
+            <w:shd w:fill="F8E1EA" w:color="auto" w:val="clear"/>
+            <w:tcMar>
+              <w:top w:type="dxa" w:w="60"/>
+              <w:left w:type="dxa" w:w="100"/>
+              <w:bottom w:type="dxa" w:w="60"/>
+              <w:right w:type="dxa" w:w="100"/>
+            </w:tcMar>
+          </w:tcPr>
+          <w:p>
+            <w:r>
+              <w:rPr>
+                <w:rFonts w:ascii="Malgun Gothic" w:cs="Malgun Gothic" w:eastAsia="Malgun Gothic" w:hAnsi="Malgun Gothic"/>
+                <w:b/>
+                <w:bCs/>
+                <w:sz w:val="19"/>
+                <w:szCs w:val="19"/>
+              </w:rPr>
+              <w:t xml:space="preserve">촬영 기법 (샷·앵글 / 렌즈 / 무빙 / 조명 / 프레임)</w:t>
+            </w:r>
+          </w:p>
+        </w:tc>
+      </w:tr>
+      <w:tr>
+        <w:trPr>
+          <w:tblHeader w:val="false"/>
+        </w:trPr>
+        <w:tc>
+          <w:tcPr>
+            <w:tcW w:type="dxa" w:w="1618"/>
+            <w:tcBorders>
+              <w:top w:val="single" w:color="BFBFBF" w:sz="4"/>
+              <w:left w:val="single" w:color="BFBFBF" w:sz="4"/>
+              <w:bottom w:val="single" w:color="BFBFBF" w:sz="4"/>
+              <w:right w:val="single" w:color="BFBFBF" w:sz="4"/>
+            </w:tcBorders>
+            <w:tcMar>
+              <w:top w:type="dxa" w:w="60"/>
+              <w:left w:type="dxa" w:w="100"/>
+              <w:bottom w:type="dxa" w:w="60"/>
+              <w:right w:type="dxa" w:w="100"/>
+            </w:tcMar>
+          </w:tcPr>
+          <w:p>
+            <w:r>
+              <w:rPr>
+                <w:rFonts w:ascii="Malgun Gothic" w:cs="Malgun Gothic" w:eastAsia="Malgun Gothic" w:hAnsi="Malgun Gothic"/>
+                <w:sz w:val="19"/>
+                <w:szCs w:val="19"/>
+              </w:rPr>
+              <w:t xml:space="preserve">1번 주의</w:t>
+            </w:r>
+          </w:p>
+        </w:tc>
+        <w:tc>
+          <w:tcPr>
+            <w:tcW w:type="dxa" w:w="2428"/>
+            <w:tcBorders>
+              <w:top w:val="single" w:color="BFBFBF" w:sz="4"/>
+              <w:left w:val="single" w:color="BFBFBF" w:sz="4"/>
+              <w:bottom w:val="single" w:color="BFBFBF" w:sz="4"/>
+              <w:right w:val="single" w:color="BFBFBF" w:sz="4"/>
+            </w:tcBorders>
+            <w:tcMar>
+              <w:top w:type="dxa" w:w="60"/>
+              <w:left w:type="dxa" w:w="100"/>
+              <w:bottom w:type="dxa" w:w="60"/>
+              <w:right w:type="dxa" w:w="100"/>
+            </w:tcMar>
+          </w:tcPr>
+          <w:p>
+            <w:r>
+              <w:rPr>
+                <w:rFonts w:ascii="Malgun Gothic" w:cs="Malgun Gothic" w:eastAsia="Malgun Gothic" w:hAnsi="Malgun Gothic"/>
+                <w:sz w:val="19"/>
+                <w:szCs w:val="19"/>
+              </w:rPr>
+              <w:t xml:space="preserve">0:00–0:03</w:t>
+            </w:r>
+          </w:p>
+        </w:tc>
+        <w:tc>
+          <w:tcPr>
+            <w:tcW w:type="dxa" w:w="10792"/>
+            <w:tcBorders>
+              <w:top w:val="single" w:color="BFBFBF" w:sz="4"/>
+              <w:left w:val="single" w:color="BFBFBF" w:sz="4"/>
+              <w:bottom w:val="single" w:color="BFBFBF" w:sz="4"/>
+              <w:right w:val="single" w:color="BFBFBF" w:sz="4"/>
+            </w:tcBorders>
+            <w:tcMar>
+              <w:top w:type="dxa" w:w="60"/>
+              <w:left w:type="dxa" w:w="100"/>
+              <w:bottom w:type="dxa" w:w="60"/>
+              <w:right w:type="dxa" w:w="100"/>
+            </w:tcMar>
+          </w:tcPr>
+          <w:p>
+            <w:r>
+              <w:rPr>
+                <w:rFonts w:ascii="Malgun Gothic" w:cs="Malgun Gothic" w:eastAsia="Malgun Gothic" w:hAnsi="Malgun Gothic"/>
+                <w:sz w:val="19"/>
+                <w:szCs w:val="19"/>
+              </w:rPr>
+              <w:t xml:space="preserve">얼굴 클로즈업 · 눈높이 · 폰 2x(약 50mm) · 거울에 카메라 안 비치게 45° 측면 · 핸드헬드(미세 흔들림 허용) · 창가 자연광 측면 + 반대편 반사판 · 30fps · 노출/초점 고정(AE/AF 락)</w:t>
+            </w:r>
+          </w:p>
+        </w:tc>
+      </w:tr>
+      <w:tr>
+        <w:trPr>
+          <w:tblHeader w:val="false"/>
+        </w:trPr>
+        <w:tc>
+          <w:tcPr>
+            <w:tcW w:type="dxa" w:w="1618"/>
+            <w:tcBorders>
+              <w:top w:val="single" w:color="BFBFBF" w:sz="4"/>
+              <w:left w:val="single" w:color="BFBFBF" w:sz="4"/>
+              <w:bottom w:val="single" w:color="BFBFBF" w:sz="4"/>
+              <w:right w:val="single" w:color="BFBFBF" w:sz="4"/>
+            </w:tcBorders>
+            <w:tcMar>
+              <w:top w:type="dxa" w:w="60"/>
+              <w:left w:type="dxa" w:w="100"/>
+              <w:bottom w:type="dxa" w:w="60"/>
+              <w:right w:type="dxa" w:w="100"/>
+            </w:tcMar>
+          </w:tcPr>
+          <w:p>
+            <w:r>
+              <w:rPr>
+                <w:rFonts w:ascii="Malgun Gothic" w:cs="Malgun Gothic" w:eastAsia="Malgun Gothic" w:hAnsi="Malgun Gothic"/>
+                <w:sz w:val="19"/>
+                <w:szCs w:val="19"/>
+              </w:rPr>
+              <w:t xml:space="preserve">2번 흥미</w:t>
+            </w:r>
+          </w:p>
+        </w:tc>
+        <w:tc>
+          <w:tcPr>
+            <w:tcW w:type="dxa" w:w="2428"/>
+            <w:tcBorders>
+              <w:top w:val="single" w:color="BFBFBF" w:sz="4"/>
+              <w:left w:val="single" w:color="BFBFBF" w:sz="4"/>
+              <w:bottom w:val="single" w:color="BFBFBF" w:sz="4"/>
+              <w:right w:val="single" w:color="BFBFBF" w:sz="4"/>
+            </w:tcBorders>
+            <w:tcMar>
+              <w:top w:type="dxa" w:w="60"/>
+              <w:left w:type="dxa" w:w="100"/>
+              <w:bottom w:type="dxa" w:w="60"/>
+              <w:right w:type="dxa" w:w="100"/>
+            </w:tcMar>
+          </w:tcPr>
+          <w:p>
+            <w:r>
+              <w:rPr>
+                <w:rFonts w:ascii="Malgun Gothic" w:cs="Malgun Gothic" w:eastAsia="Malgun Gothic" w:hAnsi="Malgun Gothic"/>
+                <w:sz w:val="19"/>
+                <w:szCs w:val="19"/>
+              </w:rPr>
+              <w:t xml:space="preserve">0:03–0:06</w:t>
+            </w:r>
+          </w:p>
+        </w:tc>
+        <w:tc>
+          <w:tcPr>
+            <w:tcW w:type="dxa" w:w="10792"/>
+            <w:tcBorders>
+              <w:top w:val="single" w:color="BFBFBF" w:sz="4"/>
+              <w:left w:val="single" w:color="BFBFBF" w:sz="4"/>
+              <w:bottom w:val="single" w:color="BFBFBF" w:sz="4"/>
+              <w:right w:val="single" w:color="BFBFBF" w:sz="4"/>
+            </w:tcBorders>
+            <w:tcMar>
+              <w:top w:type="dxa" w:w="60"/>
+              <w:left w:type="dxa" w:w="100"/>
+              <w:bottom w:type="dxa" w:w="60"/>
+              <w:right w:type="dxa" w:w="100"/>
+            </w:tcMar>
+          </w:tcPr>
+          <w:p>
+            <w:r>
+              <w:rPr>
+                <w:rFonts w:ascii="Malgun Gothic" w:cs="Malgun Gothic" w:eastAsia="Malgun Gothic" w:hAnsi="Malgun Gothic"/>
+                <w:sz w:val="19"/>
+                <w:szCs w:val="19"/>
+              </w:rPr>
+              <w:t xml:space="preserve">탑뷰 테이블샷 → 정면 미디엄 · 1x · 폰을 천천히 앞으로 밀기(푸시인, 줌 금지) · 소프트박스 45° 정면 · 라벨 반사 없게 조명 각도 조절 · 30fps</w:t>
+            </w:r>
+          </w:p>
+        </w:tc>
+      </w:tr>
+      <w:tr>
+        <w:trPr>
+          <w:tblHeader w:val="false"/>
+        </w:trPr>
+        <w:tc>
+          <w:tcPr>
+            <w:tcW w:type="dxa" w:w="1618"/>
+            <w:tcBorders>
+              <w:top w:val="single" w:color="BFBFBF" w:sz="4"/>
+              <w:left w:val="single" w:color="BFBFBF" w:sz="4"/>
+              <w:bottom w:val="single" w:color="BFBFBF" w:sz="4"/>
+              <w:right w:val="single" w:color="BFBFBF" w:sz="4"/>
+            </w:tcBorders>
+            <w:tcMar>
+              <w:top w:type="dxa" w:w="60"/>
+              <w:left w:type="dxa" w:w="100"/>
+              <w:bottom w:type="dxa" w:w="60"/>
+              <w:right w:type="dxa" w:w="100"/>
+            </w:tcMar>
+          </w:tcPr>
+          <w:p>
+            <w:r>
+              <w:rPr>
+                <w:rFonts w:ascii="Malgun Gothic" w:cs="Malgun Gothic" w:eastAsia="Malgun Gothic" w:hAnsi="Malgun Gothic"/>
+                <w:sz w:val="19"/>
+                <w:szCs w:val="19"/>
+              </w:rPr>
+              <w:t xml:space="preserve">3번 흥미</w:t>
+            </w:r>
+          </w:p>
+        </w:tc>
+        <w:tc>
+          <w:tcPr>
+            <w:tcW w:type="dxa" w:w="2428"/>
+            <w:tcBorders>
+              <w:top w:val="single" w:color="BFBFBF" w:sz="4"/>
+              <w:left w:val="single" w:color="BFBFBF" w:sz="4"/>
+              <w:bottom w:val="single" w:color="BFBFBF" w:sz="4"/>
+              <w:right w:val="single" w:color="BFBFBF" w:sz="4"/>
+            </w:tcBorders>
+            <w:tcMar>
+              <w:top w:type="dxa" w:w="60"/>
+              <w:left w:type="dxa" w:w="100"/>
+              <w:bottom w:type="dxa" w:w="60"/>
+              <w:right w:type="dxa" w:w="100"/>
+            </w:tcMar>
+          </w:tcPr>
+          <w:p>
+            <w:r>
+              <w:rPr>
+                <w:rFonts w:ascii="Malgun Gothic" w:cs="Malgun Gothic" w:eastAsia="Malgun Gothic" w:hAnsi="Malgun Gothic"/>
+                <w:sz w:val="19"/>
+                <w:szCs w:val="19"/>
+              </w:rPr>
+              <w:t xml:space="preserve">0:06–0:10</w:t>
+            </w:r>
+          </w:p>
+        </w:tc>
+        <w:tc>
+          <w:tcPr>
+            <w:tcW w:type="dxa" w:w="10792"/>
+            <w:tcBorders>
+              <w:top w:val="single" w:color="BFBFBF" w:sz="4"/>
+              <w:left w:val="single" w:color="BFBFBF" w:sz="4"/>
+              <w:bottom w:val="single" w:color="BFBFBF" w:sz="4"/>
+              <w:right w:val="single" w:color="BFBFBF" w:sz="4"/>
+            </w:tcBorders>
+            <w:tcMar>
+              <w:top w:type="dxa" w:w="60"/>
+              <w:left w:type="dxa" w:w="100"/>
+              <w:bottom w:type="dxa" w:w="60"/>
+              <w:right w:type="dxa" w:w="100"/>
+            </w:tcMar>
+          </w:tcPr>
+          <w:p>
+            <w:r>
+              <w:rPr>
+                <w:rFonts w:ascii="Malgun Gothic" w:cs="Malgun Gothic" w:eastAsia="Malgun Gothic" w:hAnsi="Malgun Gothic"/>
+                <w:sz w:val="19"/>
+                <w:szCs w:val="19"/>
+              </w:rPr>
+              <w:t xml:space="preserve">매크로(접사 렌즈 또는 3x 근접) · 삼각대 고정 · 수동 초점 손등에 고정 · 역광(백라이트)으로 제형 투명감 · 배경 어둡게 · 60fps 촬영 → 50% 슬로</w:t>
+            </w:r>
+          </w:p>
+        </w:tc>
+      </w:tr>
+      <w:tr>
+        <w:trPr>
+          <w:tblHeader w:val="false"/>
+        </w:trPr>
+        <w:tc>
+          <w:tcPr>
+            <w:tcW w:type="dxa" w:w="1618"/>
+            <w:tcBorders>
+              <w:top w:val="single" w:color="BFBFBF" w:sz="4"/>
+              <w:left w:val="single" w:color="BFBFBF" w:sz="4"/>
+              <w:bottom w:val="single" w:color="BFBFBF" w:sz="4"/>
+              <w:right w:val="single" w:color="BFBFBF" w:sz="4"/>
+            </w:tcBorders>
+            <w:tcMar>
+              <w:top w:type="dxa" w:w="60"/>
+              <w:left w:type="dxa" w:w="100"/>
+              <w:bottom w:type="dxa" w:w="60"/>
+              <w:right w:type="dxa" w:w="100"/>
+            </w:tcMar>
+          </w:tcPr>
+          <w:p>
+            <w:r>
+              <w:rPr>
+                <w:rFonts w:ascii="Malgun Gothic" w:cs="Malgun Gothic" w:eastAsia="Malgun Gothic" w:hAnsi="Malgun Gothic"/>
+                <w:sz w:val="19"/>
+                <w:szCs w:val="19"/>
+              </w:rPr>
+              <w:t xml:space="preserve">4번 욕망</w:t>
+            </w:r>
+          </w:p>
+        </w:tc>
+        <w:tc>
+          <w:tcPr>
+            <w:tcW w:type="dxa" w:w="2428"/>
+            <w:tcBorders>
+              <w:top w:val="single" w:color="BFBFBF" w:sz="4"/>
+              <w:left w:val="single" w:color="BFBFBF" w:sz="4"/>
+              <w:bottom w:val="single" w:color="BFBFBF" w:sz="4"/>
+              <w:right w:val="single" w:color="BFBFBF" w:sz="4"/>
+            </w:tcBorders>
+            <w:tcMar>
+              <w:top w:type="dxa" w:w="60"/>
+              <w:left w:type="dxa" w:w="100"/>
+              <w:bottom w:type="dxa" w:w="60"/>
+              <w:right w:type="dxa" w:w="100"/>
+            </w:tcMar>
+          </w:tcPr>
+          <w:p>
+            <w:r>
+              <w:rPr>
+                <w:rFonts w:ascii="Malgun Gothic" w:cs="Malgun Gothic" w:eastAsia="Malgun Gothic" w:hAnsi="Malgun Gothic"/>
+                <w:sz w:val="19"/>
+                <w:szCs w:val="19"/>
+              </w:rPr>
+              <w:t xml:space="preserve">0:10–0:15</w:t>
+            </w:r>
+          </w:p>
+        </w:tc>
+        <w:tc>
+          <w:tcPr>
+            <w:tcW w:type="dxa" w:w="10792"/>
+            <w:tcBorders>
+              <w:top w:val="single" w:color="BFBFBF" w:sz="4"/>
+              <w:left w:val="single" w:color="BFBFBF" w:sz="4"/>
+              <w:bottom w:val="single" w:color="BFBFBF" w:sz="4"/>
+              <w:right w:val="single" w:color="BFBFBF" w:sz="4"/>
+            </w:tcBorders>
+            <w:tcMar>
+              <w:top w:type="dxa" w:w="60"/>
+              <w:left w:type="dxa" w:w="100"/>
+              <w:bottom w:type="dxa" w:w="60"/>
+              <w:right w:type="dxa" w:w="100"/>
+            </w:tcMar>
+          </w:tcPr>
+          <w:p>
+            <w:r>
+              <w:rPr>
+                <w:rFonts w:ascii="Malgun Gothic" w:cs="Malgun Gothic" w:eastAsia="Malgun Gothic" w:hAnsi="Malgun Gothic"/>
+                <w:sz w:val="19"/>
+                <w:szCs w:val="19"/>
+              </w:rPr>
+              <w:t xml:space="preserve">정면 얼굴 클로즈업 · 2x · 삼각대 눈높이 · 링라이트 정면 + 창 측광 · 화이트밸런스 5000K 수동 고정 · 30fps</w:t>
+            </w:r>
+          </w:p>
+        </w:tc>
+      </w:tr>
+      <w:tr>
+        <w:trPr>
+          <w:tblHeader w:val="false"/>
+        </w:trPr>
+        <w:tc>
+          <w:tcPr>
+            <w:tcW w:type="dxa" w:w="1618"/>
+            <w:tcBorders>
+              <w:top w:val="single" w:color="BFBFBF" w:sz="4"/>
+              <w:left w:val="single" w:color="BFBFBF" w:sz="4"/>
+              <w:bottom w:val="single" w:color="BFBFBF" w:sz="4"/>
+              <w:right w:val="single" w:color="BFBFBF" w:sz="4"/>
+            </w:tcBorders>
+            <w:tcMar>
+              <w:top w:type="dxa" w:w="60"/>
+              <w:left w:type="dxa" w:w="100"/>
+              <w:bottom w:type="dxa" w:w="60"/>
+              <w:right w:type="dxa" w:w="100"/>
+            </w:tcMar>
+          </w:tcPr>
+          <w:p>
+            <w:r>
+              <w:rPr>
+                <w:rFonts w:ascii="Malgun Gothic" w:cs="Malgun Gothic" w:eastAsia="Malgun Gothic" w:hAnsi="Malgun Gothic"/>
+                <w:sz w:val="19"/>
+                <w:szCs w:val="19"/>
+              </w:rPr>
+              <w:t xml:space="preserve">5번 욕망</w:t>
+            </w:r>
+          </w:p>
+        </w:tc>
+        <w:tc>
+          <w:tcPr>
+            <w:tcW w:type="dxa" w:w="2428"/>
+            <w:tcBorders>
+              <w:top w:val="single" w:color="BFBFBF" w:sz="4"/>
+              <w:left w:val="single" w:color="BFBFBF" w:sz="4"/>
+              <w:bottom w:val="single" w:color="BFBFBF" w:sz="4"/>
+              <w:right w:val="single" w:color="BFBFBF" w:sz="4"/>
+            </w:tcBorders>
+            <w:tcMar>
+              <w:top w:type="dxa" w:w="60"/>
+              <w:left w:type="dxa" w:w="100"/>
+              <w:bottom w:type="dxa" w:w="60"/>
+              <w:right w:type="dxa" w:w="100"/>
+            </w:tcMar>
+          </w:tcPr>
+          <w:p>
+            <w:r>
+              <w:rPr>
+                <w:rFonts w:ascii="Malgun Gothic" w:cs="Malgun Gothic" w:eastAsia="Malgun Gothic" w:hAnsi="Malgun Gothic"/>
+                <w:sz w:val="19"/>
+                <w:szCs w:val="19"/>
+              </w:rPr>
+              <w:t xml:space="preserve">0:15–0:20</w:t>
+            </w:r>
+          </w:p>
+        </w:tc>
+        <w:tc>
+          <w:tcPr>
+            <w:tcW w:type="dxa" w:w="10792"/>
+            <w:tcBorders>
+              <w:top w:val="single" w:color="BFBFBF" w:sz="4"/>
+              <w:left w:val="single" w:color="BFBFBF" w:sz="4"/>
+              <w:bottom w:val="single" w:color="BFBFBF" w:sz="4"/>
+              <w:right w:val="single" w:color="BFBFBF" w:sz="4"/>
+            </w:tcBorders>
+            <w:tcMar>
+              <w:top w:type="dxa" w:w="60"/>
+              <w:left w:type="dxa" w:w="100"/>
+              <w:bottom w:type="dxa" w:w="60"/>
+              <w:right w:type="dxa" w:w="100"/>
+            </w:tcMar>
+          </w:tcPr>
+          <w:p>
+            <w:r>
+              <w:rPr>
+                <w:rFonts w:ascii="Malgun Gothic" w:cs="Malgun Gothic" w:eastAsia="Malgun Gothic" w:hAnsi="Malgun Gothic"/>
+                <w:sz w:val="19"/>
+                <w:szCs w:val="19"/>
+              </w:rPr>
+              <w:t xml:space="preserve">A1과 같은 위치·조명·각도(전후 비교 조건 동일) · 볼 클로즈업 3x · 45° 측광으로 피부결 표현 · 보정·필터 금지 · 30fps</w:t>
+            </w:r>
+          </w:p>
+        </w:tc>
+      </w:tr>
+      <w:tr>
+        <w:trPr>
+          <w:tblHeader w:val="false"/>
+        </w:trPr>
+        <w:tc>
+          <w:tcPr>
+            <w:tcW w:type="dxa" w:w="1618"/>
+            <w:tcBorders>
+              <w:top w:val="single" w:color="BFBFBF" w:sz="4"/>
+              <w:left w:val="single" w:color="BFBFBF" w:sz="4"/>
+              <w:bottom w:val="single" w:color="BFBFBF" w:sz="4"/>
+              <w:right w:val="single" w:color="BFBFBF" w:sz="4"/>
+            </w:tcBorders>
+            <w:tcMar>
+              <w:top w:type="dxa" w:w="60"/>
+              <w:left w:type="dxa" w:w="100"/>
+              <w:bottom w:type="dxa" w:w="60"/>
+              <w:right w:type="dxa" w:w="100"/>
+            </w:tcMar>
+          </w:tcPr>
+          <w:p>
+            <w:r>
+              <w:rPr>
+                <w:rFonts w:ascii="Malgun Gothic" w:cs="Malgun Gothic" w:eastAsia="Malgun Gothic" w:hAnsi="Malgun Gothic"/>
+                <w:sz w:val="19"/>
+                <w:szCs w:val="19"/>
+              </w:rPr>
+              <w:t xml:space="preserve">6번 행동</w:t>
+            </w:r>
+          </w:p>
+        </w:tc>
+        <w:tc>
+          <w:tcPr>
+            <w:tcW w:type="dxa" w:w="2428"/>
+            <w:tcBorders>
+              <w:top w:val="single" w:color="BFBFBF" w:sz="4"/>
+              <w:left w:val="single" w:color="BFBFBF" w:sz="4"/>
+              <w:bottom w:val="single" w:color="BFBFBF" w:sz="4"/>
+              <w:right w:val="single" w:color="BFBFBF" w:sz="4"/>
+            </w:tcBorders>
+            <w:tcMar>
+              <w:top w:type="dxa" w:w="60"/>
+              <w:left w:type="dxa" w:w="100"/>
+              <w:bottom w:type="dxa" w:w="60"/>
+              <w:right w:type="dxa" w:w="100"/>
+            </w:tcMar>
+          </w:tcPr>
+          <w:p>
+            <w:r>
+              <w:rPr>
+                <w:rFonts w:ascii="Malgun Gothic" w:cs="Malgun Gothic" w:eastAsia="Malgun Gothic" w:hAnsi="Malgun Gothic"/>
+                <w:sz w:val="19"/>
+                <w:szCs w:val="19"/>
+              </w:rPr>
+              <w:t xml:space="preserve">0:20–0:25</w:t>
+            </w:r>
+          </w:p>
+        </w:tc>
+        <w:tc>
+          <w:tcPr>
+            <w:tcW w:type="dxa" w:w="10792"/>
+            <w:tcBorders>
+              <w:top w:val="single" w:color="BFBFBF" w:sz="4"/>
+              <w:left w:val="single" w:color="BFBFBF" w:sz="4"/>
+              <w:bottom w:val="single" w:color="BFBFBF" w:sz="4"/>
+              <w:right w:val="single" w:color="BFBFBF" w:sz="4"/>
+            </w:tcBorders>
+            <w:tcMar>
+              <w:top w:type="dxa" w:w="60"/>
+              <w:left w:type="dxa" w:w="100"/>
+              <w:bottom w:type="dxa" w:w="60"/>
+              <w:right w:type="dxa" w:w="100"/>
+            </w:tcMar>
+          </w:tcPr>
+          <w:p>
+            <w:r>
+              <w:rPr>
+                <w:rFonts w:ascii="Malgun Gothic" w:cs="Malgun Gothic" w:eastAsia="Malgun Gothic" w:hAnsi="Malgun Gothic"/>
+                <w:sz w:val="19"/>
+                <w:szCs w:val="19"/>
+              </w:rPr>
+              <w:t xml:space="preserve">바스트샷 · 1x · 정면 눈높이 · 천천히 푸시인 · 링라이트 · 마지막 1.5초 정지 화면 · 30fps</w:t>
+            </w:r>
+          </w:p>
+        </w:tc>
+      </w:tr>
+    </w:tbl>
+    <w:p/>
+    <w:p>
       <w:pPr>
         <w:pStyle w:val="Heading1"/>
         <w:spacing w:after="120" w:before="240"/>
@@ -3944,6 +4715,562 @@
                 <w:szCs w:val="17"/>
               </w:rPr>
               <w:t xml:space="preserve">5번 · 0:20</w:t>
+            </w:r>
+          </w:p>
+        </w:tc>
+      </w:tr>
+    </w:tbl>
+    <w:p/>
+    <w:p>
+      <w:r>
+        <w:rPr>
+          <w:rFonts w:ascii="Malgun Gothic" w:cs="Malgun Gothic" w:eastAsia="Malgun Gothic" w:hAnsi="Malgun Gothic"/>
+          <w:b/>
+          <w:bCs/>
+          <w:sz w:val="20"/>
+          <w:szCs w:val="20"/>
+        </w:rPr>
+        <w:t xml:space="preserve">B안 촬영 기법</w:t>
+      </w:r>
+    </w:p>
+    <w:tbl>
+      <w:tblPr>
+        <w:tblW w:type="dxa" w:w="14838"/>
+        <w:tblBorders>
+          <w:top w:val="single" w:color="auto" w:sz="4"/>
+          <w:left w:val="single" w:color="auto" w:sz="4"/>
+          <w:bottom w:val="single" w:color="auto" w:sz="4"/>
+          <w:right w:val="single" w:color="auto" w:sz="4"/>
+          <w:insideH w:val="single" w:color="auto" w:sz="4"/>
+          <w:insideV w:val="single" w:color="auto" w:sz="4"/>
+        </w:tblBorders>
+      </w:tblPr>
+      <w:tblGrid>
+        <w:gridCol w:w="1618"/>
+        <w:gridCol w:w="2428"/>
+        <w:gridCol w:w="10792"/>
+      </w:tblGrid>
+      <w:tr>
+        <w:trPr>
+          <w:tblHeader/>
+        </w:trPr>
+        <w:tc>
+          <w:tcPr>
+            <w:tcW w:type="dxa" w:w="1618"/>
+            <w:tcBorders>
+              <w:top w:val="single" w:color="BFBFBF" w:sz="4"/>
+              <w:left w:val="single" w:color="BFBFBF" w:sz="4"/>
+              <w:bottom w:val="single" w:color="BFBFBF" w:sz="4"/>
+              <w:right w:val="single" w:color="BFBFBF" w:sz="4"/>
+            </w:tcBorders>
+            <w:shd w:fill="F8E1EA" w:color="auto" w:val="clear"/>
+            <w:tcMar>
+              <w:top w:type="dxa" w:w="60"/>
+              <w:left w:type="dxa" w:w="100"/>
+              <w:bottom w:type="dxa" w:w="60"/>
+              <w:right w:type="dxa" w:w="100"/>
+            </w:tcMar>
+          </w:tcPr>
+          <w:p>
+            <w:r>
+              <w:rPr>
+                <w:rFonts w:ascii="Malgun Gothic" w:cs="Malgun Gothic" w:eastAsia="Malgun Gothic" w:hAnsi="Malgun Gothic"/>
+                <w:b/>
+                <w:bCs/>
+                <w:sz w:val="19"/>
+                <w:szCs w:val="19"/>
+              </w:rPr>
+              <w:t xml:space="preserve">장면</w:t>
+            </w:r>
+          </w:p>
+        </w:tc>
+        <w:tc>
+          <w:tcPr>
+            <w:tcW w:type="dxa" w:w="2428"/>
+            <w:tcBorders>
+              <w:top w:val="single" w:color="BFBFBF" w:sz="4"/>
+              <w:left w:val="single" w:color="BFBFBF" w:sz="4"/>
+              <w:bottom w:val="single" w:color="BFBFBF" w:sz="4"/>
+              <w:right w:val="single" w:color="BFBFBF" w:sz="4"/>
+            </w:tcBorders>
+            <w:shd w:fill="F8E1EA" w:color="auto" w:val="clear"/>
+            <w:tcMar>
+              <w:top w:type="dxa" w:w="60"/>
+              <w:left w:type="dxa" w:w="100"/>
+              <w:bottom w:type="dxa" w:w="60"/>
+              <w:right w:type="dxa" w:w="100"/>
+            </w:tcMar>
+          </w:tcPr>
+          <w:p>
+            <w:r>
+              <w:rPr>
+                <w:rFonts w:ascii="Malgun Gothic" w:cs="Malgun Gothic" w:eastAsia="Malgun Gothic" w:hAnsi="Malgun Gothic"/>
+                <w:b/>
+                <w:bCs/>
+                <w:sz w:val="19"/>
+                <w:szCs w:val="19"/>
+              </w:rPr>
+              <w:t xml:space="preserve">시간</w:t>
+            </w:r>
+          </w:p>
+        </w:tc>
+        <w:tc>
+          <w:tcPr>
+            <w:tcW w:type="dxa" w:w="10792"/>
+            <w:tcBorders>
+              <w:top w:val="single" w:color="BFBFBF" w:sz="4"/>
+              <w:left w:val="single" w:color="BFBFBF" w:sz="4"/>
+              <w:bottom w:val="single" w:color="BFBFBF" w:sz="4"/>
+              <w:right w:val="single" w:color="BFBFBF" w:sz="4"/>
+            </w:tcBorders>
+            <w:shd w:fill="F8E1EA" w:color="auto" w:val="clear"/>
+            <w:tcMar>
+              <w:top w:type="dxa" w:w="60"/>
+              <w:left w:type="dxa" w:w="100"/>
+              <w:bottom w:type="dxa" w:w="60"/>
+              <w:right w:type="dxa" w:w="100"/>
+            </w:tcMar>
+          </w:tcPr>
+          <w:p>
+            <w:r>
+              <w:rPr>
+                <w:rFonts w:ascii="Malgun Gothic" w:cs="Malgun Gothic" w:eastAsia="Malgun Gothic" w:hAnsi="Malgun Gothic"/>
+                <w:b/>
+                <w:bCs/>
+                <w:sz w:val="19"/>
+                <w:szCs w:val="19"/>
+              </w:rPr>
+              <w:t xml:space="preserve">촬영 기법 (샷·앵글 / 렌즈 / 무빙 / 조명 / 프레임)</w:t>
+            </w:r>
+          </w:p>
+        </w:tc>
+      </w:tr>
+      <w:tr>
+        <w:trPr>
+          <w:tblHeader w:val="false"/>
+        </w:trPr>
+        <w:tc>
+          <w:tcPr>
+            <w:tcW w:type="dxa" w:w="1618"/>
+            <w:tcBorders>
+              <w:top w:val="single" w:color="BFBFBF" w:sz="4"/>
+              <w:left w:val="single" w:color="BFBFBF" w:sz="4"/>
+              <w:bottom w:val="single" w:color="BFBFBF" w:sz="4"/>
+              <w:right w:val="single" w:color="BFBFBF" w:sz="4"/>
+            </w:tcBorders>
+            <w:tcMar>
+              <w:top w:type="dxa" w:w="60"/>
+              <w:left w:type="dxa" w:w="100"/>
+              <w:bottom w:type="dxa" w:w="60"/>
+              <w:right w:type="dxa" w:w="100"/>
+            </w:tcMar>
+          </w:tcPr>
+          <w:p>
+            <w:r>
+              <w:rPr>
+                <w:rFonts w:ascii="Malgun Gothic" w:cs="Malgun Gothic" w:eastAsia="Malgun Gothic" w:hAnsi="Malgun Gothic"/>
+                <w:sz w:val="19"/>
+                <w:szCs w:val="19"/>
+              </w:rPr>
+              <w:t xml:space="preserve">1번 주의</w:t>
+            </w:r>
+          </w:p>
+        </w:tc>
+        <w:tc>
+          <w:tcPr>
+            <w:tcW w:type="dxa" w:w="2428"/>
+            <w:tcBorders>
+              <w:top w:val="single" w:color="BFBFBF" w:sz="4"/>
+              <w:left w:val="single" w:color="BFBFBF" w:sz="4"/>
+              <w:bottom w:val="single" w:color="BFBFBF" w:sz="4"/>
+              <w:right w:val="single" w:color="BFBFBF" w:sz="4"/>
+            </w:tcBorders>
+            <w:tcMar>
+              <w:top w:type="dxa" w:w="60"/>
+              <w:left w:type="dxa" w:w="100"/>
+              <w:bottom w:type="dxa" w:w="60"/>
+              <w:right w:type="dxa" w:w="100"/>
+            </w:tcMar>
+          </w:tcPr>
+          <w:p>
+            <w:r>
+              <w:rPr>
+                <w:rFonts w:ascii="Malgun Gothic" w:cs="Malgun Gothic" w:eastAsia="Malgun Gothic" w:hAnsi="Malgun Gothic"/>
+                <w:sz w:val="19"/>
+                <w:szCs w:val="19"/>
+              </w:rPr>
+              <w:t xml:space="preserve">0:00–0:03</w:t>
+            </w:r>
+          </w:p>
+        </w:tc>
+        <w:tc>
+          <w:tcPr>
+            <w:tcW w:type="dxa" w:w="10792"/>
+            <w:tcBorders>
+              <w:top w:val="single" w:color="BFBFBF" w:sz="4"/>
+              <w:left w:val="single" w:color="BFBFBF" w:sz="4"/>
+              <w:bottom w:val="single" w:color="BFBFBF" w:sz="4"/>
+              <w:right w:val="single" w:color="BFBFBF" w:sz="4"/>
+            </w:tcBorders>
+            <w:tcMar>
+              <w:top w:type="dxa" w:w="60"/>
+              <w:left w:type="dxa" w:w="100"/>
+              <w:bottom w:type="dxa" w:w="60"/>
+              <w:right w:type="dxa" w:w="100"/>
+            </w:tcMar>
+          </w:tcPr>
+          <w:p>
+            <w:r>
+              <w:rPr>
+                <w:rFonts w:ascii="Malgun Gothic" w:cs="Malgun Gothic" w:eastAsia="Malgun Gothic" w:hAnsi="Malgun Gothic"/>
+                <w:sz w:val="19"/>
+                <w:szCs w:val="19"/>
+              </w:rPr>
+              <w:t xml:space="preserve">극접사 매크로 · 삼각대 고정 · 수동 초점을 방울 떨어지는 지점에 · 검은 배경 + 백라이트 · 120~240fps 슬로모션 · 같은 동작 5테이크 이상</w:t>
+            </w:r>
+          </w:p>
+        </w:tc>
+      </w:tr>
+      <w:tr>
+        <w:trPr>
+          <w:tblHeader w:val="false"/>
+        </w:trPr>
+        <w:tc>
+          <w:tcPr>
+            <w:tcW w:type="dxa" w:w="1618"/>
+            <w:tcBorders>
+              <w:top w:val="single" w:color="BFBFBF" w:sz="4"/>
+              <w:left w:val="single" w:color="BFBFBF" w:sz="4"/>
+              <w:bottom w:val="single" w:color="BFBFBF" w:sz="4"/>
+              <w:right w:val="single" w:color="BFBFBF" w:sz="4"/>
+            </w:tcBorders>
+            <w:tcMar>
+              <w:top w:type="dxa" w:w="60"/>
+              <w:left w:type="dxa" w:w="100"/>
+              <w:bottom w:type="dxa" w:w="60"/>
+              <w:right w:type="dxa" w:w="100"/>
+            </w:tcMar>
+          </w:tcPr>
+          <w:p>
+            <w:r>
+              <w:rPr>
+                <w:rFonts w:ascii="Malgun Gothic" w:cs="Malgun Gothic" w:eastAsia="Malgun Gothic" w:hAnsi="Malgun Gothic"/>
+                <w:sz w:val="19"/>
+                <w:szCs w:val="19"/>
+              </w:rPr>
+              <w:t xml:space="preserve">2번 흥미</w:t>
+            </w:r>
+          </w:p>
+        </w:tc>
+        <w:tc>
+          <w:tcPr>
+            <w:tcW w:type="dxa" w:w="2428"/>
+            <w:tcBorders>
+              <w:top w:val="single" w:color="BFBFBF" w:sz="4"/>
+              <w:left w:val="single" w:color="BFBFBF" w:sz="4"/>
+              <w:bottom w:val="single" w:color="BFBFBF" w:sz="4"/>
+              <w:right w:val="single" w:color="BFBFBF" w:sz="4"/>
+            </w:tcBorders>
+            <w:tcMar>
+              <w:top w:type="dxa" w:w="60"/>
+              <w:left w:type="dxa" w:w="100"/>
+              <w:bottom w:type="dxa" w:w="60"/>
+              <w:right w:type="dxa" w:w="100"/>
+            </w:tcMar>
+          </w:tcPr>
+          <w:p>
+            <w:r>
+              <w:rPr>
+                <w:rFonts w:ascii="Malgun Gothic" w:cs="Malgun Gothic" w:eastAsia="Malgun Gothic" w:hAnsi="Malgun Gothic"/>
+                <w:sz w:val="19"/>
+                <w:szCs w:val="19"/>
+              </w:rPr>
+              <w:t xml:space="preserve">0:03–0:07</w:t>
+            </w:r>
+          </w:p>
+        </w:tc>
+        <w:tc>
+          <w:tcPr>
+            <w:tcW w:type="dxa" w:w="10792"/>
+            <w:tcBorders>
+              <w:top w:val="single" w:color="BFBFBF" w:sz="4"/>
+              <w:left w:val="single" w:color="BFBFBF" w:sz="4"/>
+              <w:bottom w:val="single" w:color="BFBFBF" w:sz="4"/>
+              <w:right w:val="single" w:color="BFBFBF" w:sz="4"/>
+            </w:tcBorders>
+            <w:tcMar>
+              <w:top w:type="dxa" w:w="60"/>
+              <w:left w:type="dxa" w:w="100"/>
+              <w:bottom w:type="dxa" w:w="60"/>
+              <w:right w:type="dxa" w:w="100"/>
+            </w:tcMar>
+          </w:tcPr>
+          <w:p>
+            <w:r>
+              <w:rPr>
+                <w:rFonts w:ascii="Malgun Gothic" w:cs="Malgun Gothic" w:eastAsia="Malgun Gothic" w:hAnsi="Malgun Gothic"/>
+                <w:sz w:val="19"/>
+                <w:szCs w:val="19"/>
+              </w:rPr>
+              <w:t xml:space="preserve">손등 탑다운 매크로 · 오버헤드 암 고정 · 사이드 라이트로 제형 결 강조 · 60fps · 문지르는 소리는 근접 마이크로 별도 녹음</w:t>
+            </w:r>
+          </w:p>
+        </w:tc>
+      </w:tr>
+      <w:tr>
+        <w:trPr>
+          <w:tblHeader w:val="false"/>
+        </w:trPr>
+        <w:tc>
+          <w:tcPr>
+            <w:tcW w:type="dxa" w:w="1618"/>
+            <w:tcBorders>
+              <w:top w:val="single" w:color="BFBFBF" w:sz="4"/>
+              <w:left w:val="single" w:color="BFBFBF" w:sz="4"/>
+              <w:bottom w:val="single" w:color="BFBFBF" w:sz="4"/>
+              <w:right w:val="single" w:color="BFBFBF" w:sz="4"/>
+            </w:tcBorders>
+            <w:tcMar>
+              <w:top w:type="dxa" w:w="60"/>
+              <w:left w:type="dxa" w:w="100"/>
+              <w:bottom w:type="dxa" w:w="60"/>
+              <w:right w:type="dxa" w:w="100"/>
+            </w:tcMar>
+          </w:tcPr>
+          <w:p>
+            <w:r>
+              <w:rPr>
+                <w:rFonts w:ascii="Malgun Gothic" w:cs="Malgun Gothic" w:eastAsia="Malgun Gothic" w:hAnsi="Malgun Gothic"/>
+                <w:sz w:val="19"/>
+                <w:szCs w:val="19"/>
+              </w:rPr>
+              <w:t xml:space="preserve">3번 흥미</w:t>
+            </w:r>
+          </w:p>
+        </w:tc>
+        <w:tc>
+          <w:tcPr>
+            <w:tcW w:type="dxa" w:w="2428"/>
+            <w:tcBorders>
+              <w:top w:val="single" w:color="BFBFBF" w:sz="4"/>
+              <w:left w:val="single" w:color="BFBFBF" w:sz="4"/>
+              <w:bottom w:val="single" w:color="BFBFBF" w:sz="4"/>
+              <w:right w:val="single" w:color="BFBFBF" w:sz="4"/>
+            </w:tcBorders>
+            <w:tcMar>
+              <w:top w:type="dxa" w:w="60"/>
+              <w:left w:type="dxa" w:w="100"/>
+              <w:bottom w:type="dxa" w:w="60"/>
+              <w:right w:type="dxa" w:w="100"/>
+            </w:tcMar>
+          </w:tcPr>
+          <w:p>
+            <w:r>
+              <w:rPr>
+                <w:rFonts w:ascii="Malgun Gothic" w:cs="Malgun Gothic" w:eastAsia="Malgun Gothic" w:hAnsi="Malgun Gothic"/>
+                <w:sz w:val="19"/>
+                <w:szCs w:val="19"/>
+              </w:rPr>
+              <w:t xml:space="preserve">0:07–0:12</w:t>
+            </w:r>
+          </w:p>
+        </w:tc>
+        <w:tc>
+          <w:tcPr>
+            <w:tcW w:type="dxa" w:w="10792"/>
+            <w:tcBorders>
+              <w:top w:val="single" w:color="BFBFBF" w:sz="4"/>
+              <w:left w:val="single" w:color="BFBFBF" w:sz="4"/>
+              <w:bottom w:val="single" w:color="BFBFBF" w:sz="4"/>
+              <w:right w:val="single" w:color="BFBFBF" w:sz="4"/>
+            </w:tcBorders>
+            <w:tcMar>
+              <w:top w:type="dxa" w:w="60"/>
+              <w:left w:type="dxa" w:w="100"/>
+              <w:bottom w:type="dxa" w:w="60"/>
+              <w:right w:type="dxa" w:w="100"/>
+            </w:tcMar>
+          </w:tcPr>
+          <w:p>
+            <w:r>
+              <w:rPr>
+                <w:rFonts w:ascii="Malgun Gothic" w:cs="Malgun Gothic" w:eastAsia="Malgun Gothic" w:hAnsi="Malgun Gothic"/>
+                <w:sz w:val="19"/>
+                <w:szCs w:val="19"/>
+              </w:rPr>
+              <w:t xml:space="preserve">손등 측면 눈높이 매크로 · 손을 천천히 기울이는 동작 · 백라이트 하이라이트 · 톡톡 소리 근접 녹음(ASMR) · 60fps</w:t>
+            </w:r>
+          </w:p>
+        </w:tc>
+      </w:tr>
+      <w:tr>
+        <w:trPr>
+          <w:tblHeader w:val="false"/>
+        </w:trPr>
+        <w:tc>
+          <w:tcPr>
+            <w:tcW w:type="dxa" w:w="1618"/>
+            <w:tcBorders>
+              <w:top w:val="single" w:color="BFBFBF" w:sz="4"/>
+              <w:left w:val="single" w:color="BFBFBF" w:sz="4"/>
+              <w:bottom w:val="single" w:color="BFBFBF" w:sz="4"/>
+              <w:right w:val="single" w:color="BFBFBF" w:sz="4"/>
+            </w:tcBorders>
+            <w:tcMar>
+              <w:top w:type="dxa" w:w="60"/>
+              <w:left w:type="dxa" w:w="100"/>
+              <w:bottom w:type="dxa" w:w="60"/>
+              <w:right w:type="dxa" w:w="100"/>
+            </w:tcMar>
+          </w:tcPr>
+          <w:p>
+            <w:r>
+              <w:rPr>
+                <w:rFonts w:ascii="Malgun Gothic" w:cs="Malgun Gothic" w:eastAsia="Malgun Gothic" w:hAnsi="Malgun Gothic"/>
+                <w:sz w:val="19"/>
+                <w:szCs w:val="19"/>
+              </w:rPr>
+              <w:t xml:space="preserve">4번 욕망</w:t>
+            </w:r>
+          </w:p>
+        </w:tc>
+        <w:tc>
+          <w:tcPr>
+            <w:tcW w:type="dxa" w:w="2428"/>
+            <w:tcBorders>
+              <w:top w:val="single" w:color="BFBFBF" w:sz="4"/>
+              <w:left w:val="single" w:color="BFBFBF" w:sz="4"/>
+              <w:bottom w:val="single" w:color="BFBFBF" w:sz="4"/>
+              <w:right w:val="single" w:color="BFBFBF" w:sz="4"/>
+            </w:tcBorders>
+            <w:tcMar>
+              <w:top w:type="dxa" w:w="60"/>
+              <w:left w:type="dxa" w:w="100"/>
+              <w:bottom w:type="dxa" w:w="60"/>
+              <w:right w:type="dxa" w:w="100"/>
+            </w:tcMar>
+          </w:tcPr>
+          <w:p>
+            <w:r>
+              <w:rPr>
+                <w:rFonts w:ascii="Malgun Gothic" w:cs="Malgun Gothic" w:eastAsia="Malgun Gothic" w:hAnsi="Malgun Gothic"/>
+                <w:sz w:val="19"/>
+                <w:szCs w:val="19"/>
+              </w:rPr>
+              <w:t xml:space="preserve">0:12–0:20</w:t>
+            </w:r>
+          </w:p>
+        </w:tc>
+        <w:tc>
+          <w:tcPr>
+            <w:tcW w:type="dxa" w:w="10792"/>
+            <w:tcBorders>
+              <w:top w:val="single" w:color="BFBFBF" w:sz="4"/>
+              <w:left w:val="single" w:color="BFBFBF" w:sz="4"/>
+              <w:bottom w:val="single" w:color="BFBFBF" w:sz="4"/>
+              <w:right w:val="single" w:color="BFBFBF" w:sz="4"/>
+            </w:tcBorders>
+            <w:tcMar>
+              <w:top w:type="dxa" w:w="60"/>
+              <w:left w:type="dxa" w:w="100"/>
+              <w:bottom w:type="dxa" w:w="60"/>
+              <w:right w:type="dxa" w:w="100"/>
+            </w:tcMar>
+          </w:tcPr>
+          <w:p>
+            <w:r>
+              <w:rPr>
+                <w:rFonts w:ascii="Malgun Gothic" w:cs="Malgun Gothic" w:eastAsia="Malgun Gothic" w:hAnsi="Malgun Gothic"/>
+                <w:sz w:val="19"/>
+                <w:szCs w:val="19"/>
+              </w:rPr>
+              <w:t xml:space="preserve">볼 익스트림 클로즈업 · 창가 소프트 측광으로 윤광 하이라이트 · 수평으로 천천히 패닝 · 보정 금지 · 30fps</w:t>
+            </w:r>
+          </w:p>
+        </w:tc>
+      </w:tr>
+      <w:tr>
+        <w:trPr>
+          <w:tblHeader w:val="false"/>
+        </w:trPr>
+        <w:tc>
+          <w:tcPr>
+            <w:tcW w:type="dxa" w:w="1618"/>
+            <w:tcBorders>
+              <w:top w:val="single" w:color="BFBFBF" w:sz="4"/>
+              <w:left w:val="single" w:color="BFBFBF" w:sz="4"/>
+              <w:bottom w:val="single" w:color="BFBFBF" w:sz="4"/>
+              <w:right w:val="single" w:color="BFBFBF" w:sz="4"/>
+            </w:tcBorders>
+            <w:tcMar>
+              <w:top w:type="dxa" w:w="60"/>
+              <w:left w:type="dxa" w:w="100"/>
+              <w:bottom w:type="dxa" w:w="60"/>
+              <w:right w:type="dxa" w:w="100"/>
+            </w:tcMar>
+          </w:tcPr>
+          <w:p>
+            <w:r>
+              <w:rPr>
+                <w:rFonts w:ascii="Malgun Gothic" w:cs="Malgun Gothic" w:eastAsia="Malgun Gothic" w:hAnsi="Malgun Gothic"/>
+                <w:sz w:val="19"/>
+                <w:szCs w:val="19"/>
+              </w:rPr>
+              <w:t xml:space="preserve">5번 행동</w:t>
+            </w:r>
+          </w:p>
+        </w:tc>
+        <w:tc>
+          <w:tcPr>
+            <w:tcW w:type="dxa" w:w="2428"/>
+            <w:tcBorders>
+              <w:top w:val="single" w:color="BFBFBF" w:sz="4"/>
+              <w:left w:val="single" w:color="BFBFBF" w:sz="4"/>
+              <w:bottom w:val="single" w:color="BFBFBF" w:sz="4"/>
+              <w:right w:val="single" w:color="BFBFBF" w:sz="4"/>
+            </w:tcBorders>
+            <w:tcMar>
+              <w:top w:type="dxa" w:w="60"/>
+              <w:left w:type="dxa" w:w="100"/>
+              <w:bottom w:type="dxa" w:w="60"/>
+              <w:right w:type="dxa" w:w="100"/>
+            </w:tcMar>
+          </w:tcPr>
+          <w:p>
+            <w:r>
+              <w:rPr>
+                <w:rFonts w:ascii="Malgun Gothic" w:cs="Malgun Gothic" w:eastAsia="Malgun Gothic" w:hAnsi="Malgun Gothic"/>
+                <w:sz w:val="19"/>
+                <w:szCs w:val="19"/>
+              </w:rPr>
+              <w:t xml:space="preserve">0:20–0:25</w:t>
+            </w:r>
+          </w:p>
+        </w:tc>
+        <w:tc>
+          <w:tcPr>
+            <w:tcW w:type="dxa" w:w="10792"/>
+            <w:tcBorders>
+              <w:top w:val="single" w:color="BFBFBF" w:sz="4"/>
+              <w:left w:val="single" w:color="BFBFBF" w:sz="4"/>
+              <w:bottom w:val="single" w:color="BFBFBF" w:sz="4"/>
+              <w:right w:val="single" w:color="BFBFBF" w:sz="4"/>
+            </w:tcBorders>
+            <w:tcMar>
+              <w:top w:type="dxa" w:w="60"/>
+              <w:left w:type="dxa" w:w="100"/>
+              <w:bottom w:type="dxa" w:w="60"/>
+              <w:right w:type="dxa" w:w="100"/>
+            </w:tcMar>
+          </w:tcPr>
+          <w:p>
+            <w:r>
+              <w:rPr>
+                <w:rFonts w:ascii="Malgun Gothic" w:cs="Malgun Gothic" w:eastAsia="Malgun Gothic" w:hAnsi="Malgun Gothic"/>
+                <w:sz w:val="19"/>
+                <w:szCs w:val="19"/>
+              </w:rPr>
+              <w:t xml:space="preserve">제품 + 얼굴 미디엄 · 정면 눈높이 · 키라이트 + 필라이트 2등 · 라벨에 초점 → 얼굴로 초점 이동(랙 포커스) · 30fps</w:t>
             </w:r>
           </w:p>
         </w:tc>
@@ -5034,6 +6361,476 @@
                 <w:szCs w:val="17"/>
               </w:rPr>
               <w:t xml:space="preserve">4번 · 0:20</w:t>
+            </w:r>
+          </w:p>
+        </w:tc>
+      </w:tr>
+    </w:tbl>
+    <w:p/>
+    <w:p>
+      <w:r>
+        <w:rPr>
+          <w:rFonts w:ascii="Malgun Gothic" w:cs="Malgun Gothic" w:eastAsia="Malgun Gothic" w:hAnsi="Malgun Gothic"/>
+          <w:b/>
+          <w:bCs/>
+          <w:sz w:val="20"/>
+          <w:szCs w:val="20"/>
+        </w:rPr>
+        <w:t xml:space="preserve">C안 촬영 기법</w:t>
+      </w:r>
+    </w:p>
+    <w:tbl>
+      <w:tblPr>
+        <w:tblW w:type="dxa" w:w="14838"/>
+        <w:tblBorders>
+          <w:top w:val="single" w:color="auto" w:sz="4"/>
+          <w:left w:val="single" w:color="auto" w:sz="4"/>
+          <w:bottom w:val="single" w:color="auto" w:sz="4"/>
+          <w:right w:val="single" w:color="auto" w:sz="4"/>
+          <w:insideH w:val="single" w:color="auto" w:sz="4"/>
+          <w:insideV w:val="single" w:color="auto" w:sz="4"/>
+        </w:tblBorders>
+      </w:tblPr>
+      <w:tblGrid>
+        <w:gridCol w:w="1618"/>
+        <w:gridCol w:w="2428"/>
+        <w:gridCol w:w="10792"/>
+      </w:tblGrid>
+      <w:tr>
+        <w:trPr>
+          <w:tblHeader/>
+        </w:trPr>
+        <w:tc>
+          <w:tcPr>
+            <w:tcW w:type="dxa" w:w="1618"/>
+            <w:tcBorders>
+              <w:top w:val="single" w:color="BFBFBF" w:sz="4"/>
+              <w:left w:val="single" w:color="BFBFBF" w:sz="4"/>
+              <w:bottom w:val="single" w:color="BFBFBF" w:sz="4"/>
+              <w:right w:val="single" w:color="BFBFBF" w:sz="4"/>
+            </w:tcBorders>
+            <w:shd w:fill="F8E1EA" w:color="auto" w:val="clear"/>
+            <w:tcMar>
+              <w:top w:type="dxa" w:w="60"/>
+              <w:left w:type="dxa" w:w="100"/>
+              <w:bottom w:type="dxa" w:w="60"/>
+              <w:right w:type="dxa" w:w="100"/>
+            </w:tcMar>
+          </w:tcPr>
+          <w:p>
+            <w:r>
+              <w:rPr>
+                <w:rFonts w:ascii="Malgun Gothic" w:cs="Malgun Gothic" w:eastAsia="Malgun Gothic" w:hAnsi="Malgun Gothic"/>
+                <w:b/>
+                <w:bCs/>
+                <w:sz w:val="19"/>
+                <w:szCs w:val="19"/>
+              </w:rPr>
+              <w:t xml:space="preserve">장면</w:t>
+            </w:r>
+          </w:p>
+        </w:tc>
+        <w:tc>
+          <w:tcPr>
+            <w:tcW w:type="dxa" w:w="2428"/>
+            <w:tcBorders>
+              <w:top w:val="single" w:color="BFBFBF" w:sz="4"/>
+              <w:left w:val="single" w:color="BFBFBF" w:sz="4"/>
+              <w:bottom w:val="single" w:color="BFBFBF" w:sz="4"/>
+              <w:right w:val="single" w:color="BFBFBF" w:sz="4"/>
+            </w:tcBorders>
+            <w:shd w:fill="F8E1EA" w:color="auto" w:val="clear"/>
+            <w:tcMar>
+              <w:top w:type="dxa" w:w="60"/>
+              <w:left w:type="dxa" w:w="100"/>
+              <w:bottom w:type="dxa" w:w="60"/>
+              <w:right w:type="dxa" w:w="100"/>
+            </w:tcMar>
+          </w:tcPr>
+          <w:p>
+            <w:r>
+              <w:rPr>
+                <w:rFonts w:ascii="Malgun Gothic" w:cs="Malgun Gothic" w:eastAsia="Malgun Gothic" w:hAnsi="Malgun Gothic"/>
+                <w:b/>
+                <w:bCs/>
+                <w:sz w:val="19"/>
+                <w:szCs w:val="19"/>
+              </w:rPr>
+              <w:t xml:space="preserve">시간</w:t>
+            </w:r>
+          </w:p>
+        </w:tc>
+        <w:tc>
+          <w:tcPr>
+            <w:tcW w:type="dxa" w:w="10792"/>
+            <w:tcBorders>
+              <w:top w:val="single" w:color="BFBFBF" w:sz="4"/>
+              <w:left w:val="single" w:color="BFBFBF" w:sz="4"/>
+              <w:bottom w:val="single" w:color="BFBFBF" w:sz="4"/>
+              <w:right w:val="single" w:color="BFBFBF" w:sz="4"/>
+            </w:tcBorders>
+            <w:shd w:fill="F8E1EA" w:color="auto" w:val="clear"/>
+            <w:tcMar>
+              <w:top w:type="dxa" w:w="60"/>
+              <w:left w:type="dxa" w:w="100"/>
+              <w:bottom w:type="dxa" w:w="60"/>
+              <w:right w:type="dxa" w:w="100"/>
+            </w:tcMar>
+          </w:tcPr>
+          <w:p>
+            <w:r>
+              <w:rPr>
+                <w:rFonts w:ascii="Malgun Gothic" w:cs="Malgun Gothic" w:eastAsia="Malgun Gothic" w:hAnsi="Malgun Gothic"/>
+                <w:b/>
+                <w:bCs/>
+                <w:sz w:val="19"/>
+                <w:szCs w:val="19"/>
+              </w:rPr>
+              <w:t xml:space="preserve">촬영 기법 (샷·앵글 / 렌즈 / 무빙 / 조명 / 프레임)</w:t>
+            </w:r>
+          </w:p>
+        </w:tc>
+      </w:tr>
+      <w:tr>
+        <w:trPr>
+          <w:tblHeader w:val="false"/>
+        </w:trPr>
+        <w:tc>
+          <w:tcPr>
+            <w:tcW w:type="dxa" w:w="1618"/>
+            <w:tcBorders>
+              <w:top w:val="single" w:color="BFBFBF" w:sz="4"/>
+              <w:left w:val="single" w:color="BFBFBF" w:sz="4"/>
+              <w:bottom w:val="single" w:color="BFBFBF" w:sz="4"/>
+              <w:right w:val="single" w:color="BFBFBF" w:sz="4"/>
+            </w:tcBorders>
+            <w:tcMar>
+              <w:top w:type="dxa" w:w="60"/>
+              <w:left w:type="dxa" w:w="100"/>
+              <w:bottom w:type="dxa" w:w="60"/>
+              <w:right w:type="dxa" w:w="100"/>
+            </w:tcMar>
+          </w:tcPr>
+          <w:p>
+            <w:r>
+              <w:rPr>
+                <w:rFonts w:ascii="Malgun Gothic" w:cs="Malgun Gothic" w:eastAsia="Malgun Gothic" w:hAnsi="Malgun Gothic"/>
+                <w:sz w:val="19"/>
+                <w:szCs w:val="19"/>
+              </w:rPr>
+              <w:t xml:space="preserve">1번 주의</w:t>
+            </w:r>
+          </w:p>
+        </w:tc>
+        <w:tc>
+          <w:tcPr>
+            <w:tcW w:type="dxa" w:w="2428"/>
+            <w:tcBorders>
+              <w:top w:val="single" w:color="BFBFBF" w:sz="4"/>
+              <w:left w:val="single" w:color="BFBFBF" w:sz="4"/>
+              <w:bottom w:val="single" w:color="BFBFBF" w:sz="4"/>
+              <w:right w:val="single" w:color="BFBFBF" w:sz="4"/>
+            </w:tcBorders>
+            <w:tcMar>
+              <w:top w:type="dxa" w:w="60"/>
+              <w:left w:type="dxa" w:w="100"/>
+              <w:bottom w:type="dxa" w:w="60"/>
+              <w:right w:type="dxa" w:w="100"/>
+            </w:tcMar>
+          </w:tcPr>
+          <w:p>
+            <w:r>
+              <w:rPr>
+                <w:rFonts w:ascii="Malgun Gothic" w:cs="Malgun Gothic" w:eastAsia="Malgun Gothic" w:hAnsi="Malgun Gothic"/>
+                <w:sz w:val="19"/>
+                <w:szCs w:val="19"/>
+              </w:rPr>
+              <w:t xml:space="preserve">0:00–0:03</w:t>
+            </w:r>
+          </w:p>
+        </w:tc>
+        <w:tc>
+          <w:tcPr>
+            <w:tcW w:type="dxa" w:w="10792"/>
+            <w:tcBorders>
+              <w:top w:val="single" w:color="BFBFBF" w:sz="4"/>
+              <w:left w:val="single" w:color="BFBFBF" w:sz="4"/>
+              <w:bottom w:val="single" w:color="BFBFBF" w:sz="4"/>
+              <w:right w:val="single" w:color="BFBFBF" w:sz="4"/>
+            </w:tcBorders>
+            <w:tcMar>
+              <w:top w:type="dxa" w:w="60"/>
+              <w:left w:type="dxa" w:w="100"/>
+              <w:bottom w:type="dxa" w:w="60"/>
+              <w:right w:type="dxa" w:w="100"/>
+            </w:tcMar>
+          </w:tcPr>
+          <w:p>
+            <w:r>
+              <w:rPr>
+                <w:rFonts w:ascii="Malgun Gothic" w:cs="Malgun Gothic" w:eastAsia="Malgun Gothic" w:hAnsi="Malgun Gothic"/>
+                <w:sz w:val="19"/>
+                <w:szCs w:val="19"/>
+              </w:rPr>
+              <w:t xml:space="preserve">정면 고정(증명사진 구도) · 삼각대 위치를 바닥 테이프로 표시 · 같은 시간대·같은 창 자연광 · 화이트밸런스·노출 수동 고정 · DAY 7과 완전히 같은 조건</w:t>
+            </w:r>
+          </w:p>
+        </w:tc>
+      </w:tr>
+      <w:tr>
+        <w:trPr>
+          <w:tblHeader w:val="false"/>
+        </w:trPr>
+        <w:tc>
+          <w:tcPr>
+            <w:tcW w:type="dxa" w:w="1618"/>
+            <w:tcBorders>
+              <w:top w:val="single" w:color="BFBFBF" w:sz="4"/>
+              <w:left w:val="single" w:color="BFBFBF" w:sz="4"/>
+              <w:bottom w:val="single" w:color="BFBFBF" w:sz="4"/>
+              <w:right w:val="single" w:color="BFBFBF" w:sz="4"/>
+            </w:tcBorders>
+            <w:tcMar>
+              <w:top w:type="dxa" w:w="60"/>
+              <w:left w:type="dxa" w:w="100"/>
+              <w:bottom w:type="dxa" w:w="60"/>
+              <w:right w:type="dxa" w:w="100"/>
+            </w:tcMar>
+          </w:tcPr>
+          <w:p>
+            <w:r>
+              <w:rPr>
+                <w:rFonts w:ascii="Malgun Gothic" w:cs="Malgun Gothic" w:eastAsia="Malgun Gothic" w:hAnsi="Malgun Gothic"/>
+                <w:sz w:val="19"/>
+                <w:szCs w:val="19"/>
+              </w:rPr>
+              <w:t xml:space="preserve">2번 흥미</w:t>
+            </w:r>
+          </w:p>
+        </w:tc>
+        <w:tc>
+          <w:tcPr>
+            <w:tcW w:type="dxa" w:w="2428"/>
+            <w:tcBorders>
+              <w:top w:val="single" w:color="BFBFBF" w:sz="4"/>
+              <w:left w:val="single" w:color="BFBFBF" w:sz="4"/>
+              <w:bottom w:val="single" w:color="BFBFBF" w:sz="4"/>
+              <w:right w:val="single" w:color="BFBFBF" w:sz="4"/>
+            </w:tcBorders>
+            <w:tcMar>
+              <w:top w:type="dxa" w:w="60"/>
+              <w:left w:type="dxa" w:w="100"/>
+              <w:bottom w:type="dxa" w:w="60"/>
+              <w:right w:type="dxa" w:w="100"/>
+            </w:tcMar>
+          </w:tcPr>
+          <w:p>
+            <w:r>
+              <w:rPr>
+                <w:rFonts w:ascii="Malgun Gothic" w:cs="Malgun Gothic" w:eastAsia="Malgun Gothic" w:hAnsi="Malgun Gothic"/>
+                <w:sz w:val="19"/>
+                <w:szCs w:val="19"/>
+              </w:rPr>
+              <w:t xml:space="preserve">0:03–0:10</w:t>
+            </w:r>
+          </w:p>
+        </w:tc>
+        <w:tc>
+          <w:tcPr>
+            <w:tcW w:type="dxa" w:w="10792"/>
+            <w:tcBorders>
+              <w:top w:val="single" w:color="BFBFBF" w:sz="4"/>
+              <w:left w:val="single" w:color="BFBFBF" w:sz="4"/>
+              <w:bottom w:val="single" w:color="BFBFBF" w:sz="4"/>
+              <w:right w:val="single" w:color="BFBFBF" w:sz="4"/>
+            </w:tcBorders>
+            <w:tcMar>
+              <w:top w:type="dxa" w:w="60"/>
+              <w:left w:type="dxa" w:w="100"/>
+              <w:bottom w:type="dxa" w:w="60"/>
+              <w:right w:type="dxa" w:w="100"/>
+            </w:tcMar>
+          </w:tcPr>
+          <w:p>
+            <w:r>
+              <w:rPr>
+                <w:rFonts w:ascii="Malgun Gothic" w:cs="Malgun Gothic" w:eastAsia="Malgun Gothic" w:hAnsi="Malgun Gothic"/>
+                <w:sz w:val="19"/>
+                <w:szCs w:val="19"/>
+              </w:rPr>
+              <w:t xml:space="preserve">거울 앞 핸드헬드 시점샷 · 0.5~1초 빠른 컷 · 손바닥 클로즈업 2x · 아침(자연광)/저녁(실내등) 조명 차이를 그대로 · 30fps</w:t>
+            </w:r>
+          </w:p>
+        </w:tc>
+      </w:tr>
+      <w:tr>
+        <w:trPr>
+          <w:tblHeader w:val="false"/>
+        </w:trPr>
+        <w:tc>
+          <w:tcPr>
+            <w:tcW w:type="dxa" w:w="1618"/>
+            <w:tcBorders>
+              <w:top w:val="single" w:color="BFBFBF" w:sz="4"/>
+              <w:left w:val="single" w:color="BFBFBF" w:sz="4"/>
+              <w:bottom w:val="single" w:color="BFBFBF" w:sz="4"/>
+              <w:right w:val="single" w:color="BFBFBF" w:sz="4"/>
+            </w:tcBorders>
+            <w:tcMar>
+              <w:top w:type="dxa" w:w="60"/>
+              <w:left w:type="dxa" w:w="100"/>
+              <w:bottom w:type="dxa" w:w="60"/>
+              <w:right w:type="dxa" w:w="100"/>
+            </w:tcMar>
+          </w:tcPr>
+          <w:p>
+            <w:r>
+              <w:rPr>
+                <w:rFonts w:ascii="Malgun Gothic" w:cs="Malgun Gothic" w:eastAsia="Malgun Gothic" w:hAnsi="Malgun Gothic"/>
+                <w:sz w:val="19"/>
+                <w:szCs w:val="19"/>
+              </w:rPr>
+              <w:t xml:space="preserve">3번 욕망</w:t>
+            </w:r>
+          </w:p>
+        </w:tc>
+        <w:tc>
+          <w:tcPr>
+            <w:tcW w:type="dxa" w:w="2428"/>
+            <w:tcBorders>
+              <w:top w:val="single" w:color="BFBFBF" w:sz="4"/>
+              <w:left w:val="single" w:color="BFBFBF" w:sz="4"/>
+              <w:bottom w:val="single" w:color="BFBFBF" w:sz="4"/>
+              <w:right w:val="single" w:color="BFBFBF" w:sz="4"/>
+            </w:tcBorders>
+            <w:tcMar>
+              <w:top w:type="dxa" w:w="60"/>
+              <w:left w:type="dxa" w:w="100"/>
+              <w:bottom w:type="dxa" w:w="60"/>
+              <w:right w:type="dxa" w:w="100"/>
+            </w:tcMar>
+          </w:tcPr>
+          <w:p>
+            <w:r>
+              <w:rPr>
+                <w:rFonts w:ascii="Malgun Gothic" w:cs="Malgun Gothic" w:eastAsia="Malgun Gothic" w:hAnsi="Malgun Gothic"/>
+                <w:sz w:val="19"/>
+                <w:szCs w:val="19"/>
+              </w:rPr>
+              <w:t xml:space="preserve">0:10–0:20</w:t>
+            </w:r>
+          </w:p>
+        </w:tc>
+        <w:tc>
+          <w:tcPr>
+            <w:tcW w:type="dxa" w:w="10792"/>
+            <w:tcBorders>
+              <w:top w:val="single" w:color="BFBFBF" w:sz="4"/>
+              <w:left w:val="single" w:color="BFBFBF" w:sz="4"/>
+              <w:bottom w:val="single" w:color="BFBFBF" w:sz="4"/>
+              <w:right w:val="single" w:color="BFBFBF" w:sz="4"/>
+            </w:tcBorders>
+            <w:tcMar>
+              <w:top w:type="dxa" w:w="60"/>
+              <w:left w:type="dxa" w:w="100"/>
+              <w:bottom w:type="dxa" w:w="60"/>
+              <w:right w:type="dxa" w:w="100"/>
+            </w:tcMar>
+          </w:tcPr>
+          <w:p>
+            <w:r>
+              <w:rPr>
+                <w:rFonts w:ascii="Malgun Gothic" w:cs="Malgun Gothic" w:eastAsia="Malgun Gothic" w:hAnsi="Malgun Gothic"/>
+                <w:sz w:val="19"/>
+                <w:szCs w:val="19"/>
+              </w:rPr>
+              <w:t xml:space="preserve">C1과 같은 표시 위치·시간대·노출·화이트밸런스 · 정면 고정 · 보정·필터 금지 · 30fps</w:t>
+            </w:r>
+          </w:p>
+        </w:tc>
+      </w:tr>
+      <w:tr>
+        <w:trPr>
+          <w:tblHeader w:val="false"/>
+        </w:trPr>
+        <w:tc>
+          <w:tcPr>
+            <w:tcW w:type="dxa" w:w="1618"/>
+            <w:tcBorders>
+              <w:top w:val="single" w:color="BFBFBF" w:sz="4"/>
+              <w:left w:val="single" w:color="BFBFBF" w:sz="4"/>
+              <w:bottom w:val="single" w:color="BFBFBF" w:sz="4"/>
+              <w:right w:val="single" w:color="BFBFBF" w:sz="4"/>
+            </w:tcBorders>
+            <w:tcMar>
+              <w:top w:type="dxa" w:w="60"/>
+              <w:left w:type="dxa" w:w="100"/>
+              <w:bottom w:type="dxa" w:w="60"/>
+              <w:right w:type="dxa" w:w="100"/>
+            </w:tcMar>
+          </w:tcPr>
+          <w:p>
+            <w:r>
+              <w:rPr>
+                <w:rFonts w:ascii="Malgun Gothic" w:cs="Malgun Gothic" w:eastAsia="Malgun Gothic" w:hAnsi="Malgun Gothic"/>
+                <w:sz w:val="19"/>
+                <w:szCs w:val="19"/>
+              </w:rPr>
+              <w:t xml:space="preserve">4번 행동</w:t>
+            </w:r>
+          </w:p>
+        </w:tc>
+        <w:tc>
+          <w:tcPr>
+            <w:tcW w:type="dxa" w:w="2428"/>
+            <w:tcBorders>
+              <w:top w:val="single" w:color="BFBFBF" w:sz="4"/>
+              <w:left w:val="single" w:color="BFBFBF" w:sz="4"/>
+              <w:bottom w:val="single" w:color="BFBFBF" w:sz="4"/>
+              <w:right w:val="single" w:color="BFBFBF" w:sz="4"/>
+            </w:tcBorders>
+            <w:tcMar>
+              <w:top w:type="dxa" w:w="60"/>
+              <w:left w:type="dxa" w:w="100"/>
+              <w:bottom w:type="dxa" w:w="60"/>
+              <w:right w:type="dxa" w:w="100"/>
+            </w:tcMar>
+          </w:tcPr>
+          <w:p>
+            <w:r>
+              <w:rPr>
+                <w:rFonts w:ascii="Malgun Gothic" w:cs="Malgun Gothic" w:eastAsia="Malgun Gothic" w:hAnsi="Malgun Gothic"/>
+                <w:sz w:val="19"/>
+                <w:szCs w:val="19"/>
+              </w:rPr>
+              <w:t xml:space="preserve">0:20–0:25</w:t>
+            </w:r>
+          </w:p>
+        </w:tc>
+        <w:tc>
+          <w:tcPr>
+            <w:tcW w:type="dxa" w:w="10792"/>
+            <w:tcBorders>
+              <w:top w:val="single" w:color="BFBFBF" w:sz="4"/>
+              <w:left w:val="single" w:color="BFBFBF" w:sz="4"/>
+              <w:bottom w:val="single" w:color="BFBFBF" w:sz="4"/>
+              <w:right w:val="single" w:color="BFBFBF" w:sz="4"/>
+            </w:tcBorders>
+            <w:tcMar>
+              <w:top w:type="dxa" w:w="60"/>
+              <w:left w:type="dxa" w:w="100"/>
+              <w:bottom w:type="dxa" w:w="60"/>
+              <w:right w:type="dxa" w:w="100"/>
+            </w:tcMar>
+          </w:tcPr>
+          <w:p>
+            <w:r>
+              <w:rPr>
+                <w:rFonts w:ascii="Malgun Gothic" w:cs="Malgun Gothic" w:eastAsia="Malgun Gothic" w:hAnsi="Malgun Gothic"/>
+                <w:sz w:val="19"/>
+                <w:szCs w:val="19"/>
+              </w:rPr>
+              <w:t xml:space="preserve">바스트샷 · 정면 · 제품 들고 웃는 얼굴 · 링라이트 · 마지막 1.5초 정지 화면 · 30fps</w:t>
             </w:r>
           </w:p>
         </w:tc>

</xml_diff>